<commit_message>
Reframe coir petition: from Chittur coconut farmers (rep. Arun); add 3-way KL/TN/CPCB table
- Petitioner is now the coconut farmers of the Chittur Assembly Constituency,
  represented by Arun (not the co-operative society).
- Addressed to the Minister in charge of Pollution Control (Environment);
  copies to the Chief Minister and the Minister for Industries & Commerce.
- Sharper, tighter prose.
- New centrepiece table comparing Kerala (KSPCB), Tamil Nadu (TNPCB) and the
  Central norm (CPCB) for each coir activity, isolating the divergence to
  retting (Red) and de-fibring/ginning (Orange) and explaining why Pollachi
  became the hub while Chittur did not. CPCB column grounded in the 2016 list
  ("Manufacturing of coir items from coconut husks" = White) and the 2023 draft.
- Model draft G.O. moved under the Environment (Pollution Control) Department.

OOXML-validated and render-verified (6 pages).

Co-authored-by: Arun T <mailarunthangavel@gmail.com>
</commit_message>
<xml_diff>
--- a/petitions/Coir-Industry-Pollution-Category-Petition.docx
+++ b/petitions/Coir-Industry-Pollution-Category-Petition.docx
@@ -16,7 +16,7 @@
           <w:sz w:val="26"/>
           <w:szCs w:val="26"/>
         </w:rPr>
-        <w:t xml:space="preserve">THE CHITTUR AGRICULTURE MARKETING SOCIETY, KOZHINJAMPARA</w:t>
+        <w:t xml:space="preserve">PETITION OF THE COCONUT FARMERS OF CHITTUR ASSEMBLY CONSTITUENCY</w:t>
       </w:r>
     </w:p>
     <w:p>
@@ -33,7 +33,7 @@
           <w:sz w:val="20"/>
           <w:szCs w:val="20"/>
         </w:rPr>
-        <w:t xml:space="preserve">Chittur Taluk, Palakkad District, Kerala</w:t>
+        <w:t xml:space="preserve">Palakkad District, Kerala — represented by Arun</w:t>
       </w:r>
     </w:p>
     <w:p>
@@ -67,7 +67,7 @@
           <w:sz w:val="26"/>
           <w:szCs w:val="26"/>
         </w:rPr>
-        <w:t xml:space="preserve">PETITION FOR POLLUTION-CATEGORY PARITY FOR THE COIR INDUSTRY IN CHITTUR</w:t>
+        <w:t xml:space="preserve">POLLUTION-CATEGORY PARITY FOR COIR PROCESSING IN CHITTUR</w:t>
       </w:r>
     </w:p>
     <w:p>
@@ -84,7 +84,7 @@
           <w:sz w:val="21"/>
           <w:szCs w:val="21"/>
         </w:rPr>
-        <w:t xml:space="preserve">Re-alignment of husk retting and coir de-fibring / ginning with the CPCB Pollution-Index methodology and with Tamil Nadu's White-category treatment of the same husk and process chain</w:t>
+        <w:t xml:space="preserve">Why Pollachi (Tamil Nadu) became a coir-processing hub while Chittur — with the same husk, 80 km away — did not</w:t>
       </w:r>
     </w:p>
     <w:p>
@@ -109,7 +109,7 @@
           <w:sz w:val="22"/>
           <w:szCs w:val="22"/>
         </w:rPr>
-        <w:t xml:space="preserve">Shri P. K. Kunhalikutty,</w:t>
+        <w:t xml:space="preserve">The Hon'ble Minister in charge of Pollution Control (Environment), Government of Kerala,</w:t>
       </w:r>
       <w:r>
         <w:br/>
@@ -121,7 +121,7 @@
           <w:sz w:val="22"/>
           <w:szCs w:val="22"/>
         </w:rPr>
-        <w:t xml:space="preserve">Hon'ble Minister for Industries &amp; Commerce, Government of Kerala,</w:t>
+        <w:t xml:space="preserve">Thiruvananthapuram.</w:t>
       </w:r>
       <w:r>
         <w:br/>
@@ -129,11 +129,13 @@
       <w:r>
         <w:rPr>
           <w:rFonts w:ascii="Times New Roman" w:cs="Times New Roman" w:eastAsia="Times New Roman" w:hAnsi="Times New Roman"/>
-          <w:color w:val="1A1A1A"/>
-          <w:sz w:val="22"/>
-          <w:szCs w:val="22"/>
-        </w:rPr>
-        <w:t xml:space="preserve">Thiruvananthapuram.</w:t>
+          <w:i/>
+          <w:iCs/>
+          <w:color w:val="555555"/>
+          <w:sz w:val="20"/>
+          <w:szCs w:val="20"/>
+        </w:rPr>
+        <w:t xml:space="preserve">(Administrative Department of the Kerala State Pollution Control Board.)</w:t>
       </w:r>
     </w:p>
     <w:p>
@@ -158,7 +160,7 @@
           <w:sz w:val="22"/>
           <w:szCs w:val="22"/>
         </w:rPr>
-        <w:t xml:space="preserve">1. Shri Ramesh Chennithala, Hon'ble Minister in charge of Coir.</w:t>
+        <w:t xml:space="preserve">1. The Hon'ble Chief Minister of Kerala.</w:t>
       </w:r>
       <w:r>
         <w:br/>
@@ -170,7 +172,7 @@
           <w:sz w:val="22"/>
           <w:szCs w:val="22"/>
         </w:rPr>
-        <w:t xml:space="preserve">2. The Chairman, Kerala State Pollution Control Board (KSPCB).</w:t>
+        <w:t xml:space="preserve">2. The Hon'ble Minister for Industries &amp; Commerce, Government of Kerala.</w:t>
       </w:r>
     </w:p>
     <w:p>
@@ -195,18 +197,18 @@
           <w:sz w:val="22"/>
           <w:szCs w:val="22"/>
         </w:rPr>
-        <w:t xml:space="preserve">The Chittur Agriculture Marketing Society, Kozhinjampara, Chittur Taluk, Palakkad District — represented by </w:t>
-      </w:r>
-      <w:r>
-        <w:rPr>
-          <w:rFonts w:ascii="Times New Roman" w:cs="Times New Roman" w:eastAsia="Times New Roman" w:hAnsi="Times New Roman"/>
-          <w:b/>
-          <w:bCs/>
-          <w:color w:val="1A1A1A"/>
-          <w:sz w:val="22"/>
-          <w:szCs w:val="22"/>
-        </w:rPr>
-        <w:t xml:space="preserve">[Name, designation]</w:t>
+        <w:t xml:space="preserve">The coconut farmers of the Chittur Assembly Constituency, Palakkad District, Kerala — represented by </w:t>
+      </w:r>
+      <w:r>
+        <w:rPr>
+          <w:rFonts w:ascii="Times New Roman" w:cs="Times New Roman" w:eastAsia="Times New Roman" w:hAnsi="Times New Roman"/>
+          <w:b/>
+          <w:bCs/>
+          <w:color w:val="1A1A1A"/>
+          <w:sz w:val="22"/>
+          <w:szCs w:val="22"/>
+        </w:rPr>
+        <w:t xml:space="preserve">Arun</w:t>
       </w:r>
       <w:r>
         <w:rPr>
@@ -231,31 +233,6 @@
           <w:sz w:val="22"/>
           <w:szCs w:val="22"/>
         </w:rPr>
-        <w:t xml:space="preserve">Through:  </w:t>
-      </w:r>
-      <w:r>
-        <w:rPr>
-          <w:rFonts w:ascii="Times New Roman" w:cs="Times New Roman" w:eastAsia="Times New Roman" w:hAnsi="Times New Roman"/>
-          <w:color w:val="1A1A1A"/>
-          <w:sz w:val="22"/>
-          <w:szCs w:val="22"/>
-        </w:rPr>
-        <w:t xml:space="preserve">Adv. Sumesh Achuthan, MLA, Chittur Constituency.</w:t>
-      </w:r>
-    </w:p>
-    <w:p>
-      <w:pPr>
-        <w:spacing w:after="60" w:line="264"/>
-      </w:pPr>
-      <w:r>
-        <w:rPr>
-          <w:rFonts w:ascii="Times New Roman" w:cs="Times New Roman" w:eastAsia="Times New Roman" w:hAnsi="Times New Roman"/>
-          <w:b/>
-          <w:bCs/>
-          <w:color w:val="1A1A1A"/>
-          <w:sz w:val="22"/>
-          <w:szCs w:val="22"/>
-        </w:rPr>
         <w:t xml:space="preserve">Date:  </w:t>
       </w:r>
       <w:r>
@@ -301,7 +278,7 @@
           <w:sz w:val="22"/>
           <w:szCs w:val="22"/>
         </w:rPr>
-        <w:t xml:space="preserve">Request to re-align the pollution-control classification of coconut-husk retting (presently Red) and coir de-fibring / ginning (presently Orange) in Kerala with the CPCB Pollution-Index norms and with Tamil Nadu's White-category treatment of the identical process chain, so that the primary coir industry can develop within Chittur instead of migrating across the district border to Pollachi (Tamil Nadu).</w:t>
+        <w:t xml:space="preserve">Request to re-align the pollution-control category of coconut-husk retting (presently Red) and coir de-fibring / ginning (presently Orange) in Kerala with the Central (CPCB) norms and with Tamil Nadu's White-category treatment of the identical process chain — so that coir processing develops in Chittur instead of migrating across the border to Pollachi.</w:t>
       </w:r>
     </w:p>
     <w:p>
@@ -335,7 +312,7 @@
           <w:sz w:val="24"/>
           <w:szCs w:val="24"/>
         </w:rPr>
-        <w:t xml:space="preserve">1.  Respected Sir</w:t>
+        <w:t xml:space="preserve">1.  The prayer in one line</w:t>
       </w:r>
     </w:p>
     <w:p>
@@ -349,121 +326,27 @@
           <w:sz w:val="22"/>
           <w:szCs w:val="22"/>
         </w:rPr>
-        <w:t xml:space="preserve">Chittur Taluk adjoins the Pollachi coir belt of Tamil Nadu and enjoys abundant coconut and coir-husk availability. Yet the </w:t>
-      </w:r>
-      <w:r>
-        <w:rPr>
-          <w:rFonts w:ascii="Times New Roman" w:cs="Times New Roman" w:eastAsia="Times New Roman" w:hAnsi="Times New Roman"/>
-          <w:b/>
-          <w:bCs/>
-          <w:color w:val="1A1A1A"/>
-          <w:sz w:val="22"/>
-          <w:szCs w:val="22"/>
-        </w:rPr>
-        <w:t xml:space="preserve">primary coir-processing industry has migrated almost entirely across the border to Pollachi</w:t>
-      </w:r>
-      <w:r>
-        <w:rPr>
-          <w:rFonts w:ascii="Times New Roman" w:cs="Times New Roman" w:eastAsia="Times New Roman" w:hAnsi="Times New Roman"/>
-          <w:color w:val="1A1A1A"/>
-          <w:sz w:val="22"/>
-          <w:szCs w:val="22"/>
-        </w:rPr>
-        <w:t xml:space="preserve"> — barely 80 km away — chiefly because of a difference in </w:t>
-      </w:r>
-      <w:r>
-        <w:rPr>
-          <w:rFonts w:ascii="Times New Roman" w:cs="Times New Roman" w:eastAsia="Times New Roman" w:hAnsi="Times New Roman"/>
-          <w:b/>
-          <w:bCs/>
-          <w:color w:val="1A1A1A"/>
-          <w:sz w:val="22"/>
-          <w:szCs w:val="22"/>
-        </w:rPr>
-        <w:t xml:space="preserve">pollution-control classification</w:t>
-      </w:r>
-      <w:r>
-        <w:rPr>
-          <w:rFonts w:ascii="Times New Roman" w:cs="Times New Roman" w:eastAsia="Times New Roman" w:hAnsi="Times New Roman"/>
-          <w:color w:val="1A1A1A"/>
-          <w:sz w:val="22"/>
-          <w:szCs w:val="22"/>
-        </w:rPr>
-        <w:t xml:space="preserve"> between the two States for one and the same raw material and process chain. We respectfully pray for a level playing field.</w:t>
-      </w:r>
-    </w:p>
-    <w:p>
-      <w:pPr>
-        <w:spacing w:after="120" w:line="276"/>
-      </w:pPr>
-      <w:r>
-        <w:rPr>
-          <w:rFonts w:ascii="Times New Roman" w:cs="Times New Roman" w:eastAsia="Times New Roman" w:hAnsi="Times New Roman"/>
-          <w:color w:val="1A1A1A"/>
-          <w:sz w:val="22"/>
-          <w:szCs w:val="22"/>
-        </w:rPr>
-        <w:t xml:space="preserve">We wish, at the outset, to state the position </w:t>
-      </w:r>
-      <w:r>
-        <w:rPr>
-          <w:rFonts w:ascii="Times New Roman" w:cs="Times New Roman" w:eastAsia="Times New Roman" w:hAnsi="Times New Roman"/>
-          <w:b/>
-          <w:bCs/>
-          <w:color w:val="1A1A1A"/>
-          <w:sz w:val="22"/>
-          <w:szCs w:val="22"/>
-        </w:rPr>
-        <w:t xml:space="preserve">precisely and without overstatement</w:t>
-      </w:r>
-      <w:r>
-        <w:rPr>
-          <w:rFonts w:ascii="Times New Roman" w:cs="Times New Roman" w:eastAsia="Times New Roman" w:hAnsi="Times New Roman"/>
-          <w:color w:val="1A1A1A"/>
-          <w:sz w:val="22"/>
-          <w:szCs w:val="22"/>
-        </w:rPr>
-        <w:t xml:space="preserve">. On an earlier occasion the classification gap was described more broadly than the record supports. Having now examined KSPCB's current classification list, we place before the Government the </w:t>
-      </w:r>
-      <w:r>
-        <w:rPr>
-          <w:rFonts w:ascii="Times New Roman" w:cs="Times New Roman" w:eastAsia="Times New Roman" w:hAnsi="Times New Roman"/>
-          <w:b/>
-          <w:bCs/>
-          <w:color w:val="1A1A1A"/>
-          <w:sz w:val="22"/>
-          <w:szCs w:val="22"/>
-        </w:rPr>
-        <w:t xml:space="preserve">exact and narrower position</w:t>
-      </w:r>
-      <w:r>
-        <w:rPr>
-          <w:rFonts w:ascii="Times New Roman" w:cs="Times New Roman" w:eastAsia="Times New Roman" w:hAnsi="Times New Roman"/>
-          <w:color w:val="1A1A1A"/>
-          <w:sz w:val="22"/>
-          <w:szCs w:val="22"/>
-        </w:rPr>
-        <w:t xml:space="preserve">: Kerala already treats dry coir manufacturing leniently (White), in line with the national CPCB norm. The genuine bottleneck for a Chittur unit is sharp and limited — </w:t>
-      </w:r>
-      <w:r>
-        <w:rPr>
-          <w:rFonts w:ascii="Times New Roman" w:cs="Times New Roman" w:eastAsia="Times New Roman" w:hAnsi="Times New Roman"/>
-          <w:b/>
-          <w:bCs/>
-          <w:color w:val="1A1A1A"/>
-          <w:sz w:val="22"/>
-          <w:szCs w:val="22"/>
-        </w:rPr>
-        <w:t xml:space="preserve">husk retting is in the Red category and coir de-fibring / ginning is in the Orange category</w:t>
-      </w:r>
-      <w:r>
-        <w:rPr>
-          <w:rFonts w:ascii="Times New Roman" w:cs="Times New Roman" w:eastAsia="Times New Roman" w:hAnsi="Times New Roman"/>
-          <w:color w:val="1A1A1A"/>
-          <w:sz w:val="22"/>
-          <w:szCs w:val="22"/>
-        </w:rPr>
-        <w:t xml:space="preserve">.</w:t>
+        <w:t xml:space="preserve">We are coconut farmers of the Chittur Assembly Constituency. We grow the coconut; the husk that comes off it is coir's raw material. We ask the Government to fix a single, provable anomaly: </w:t>
+      </w:r>
+      <w:r>
+        <w:rPr>
+          <w:rFonts w:ascii="Times New Roman" w:cs="Times New Roman" w:eastAsia="Times New Roman" w:hAnsi="Times New Roman"/>
+          <w:b/>
+          <w:bCs/>
+          <w:color w:val="1A1A1A"/>
+          <w:sz w:val="22"/>
+          <w:szCs w:val="22"/>
+        </w:rPr>
+        <w:t xml:space="preserve">Kerala places coconut-husk retting in the Red category and coir de-fibring / ginning in the Orange category, while both the Central norm and neighbouring Tamil Nadu treat the very same activities as practically non-polluting (White).</w:t>
+      </w:r>
+      <w:r>
+        <w:rPr>
+          <w:rFonts w:ascii="Times New Roman" w:cs="Times New Roman" w:eastAsia="Times New Roman" w:hAnsi="Times New Roman"/>
+          <w:color w:val="1A1A1A"/>
+          <w:sz w:val="22"/>
+          <w:szCs w:val="22"/>
+        </w:rPr>
+        <w:t xml:space="preserve"> That one gap has sent the industry — and our husk's value — across the border to Pollachi.</w:t>
       </w:r>
     </w:p>
     <w:p>
@@ -480,7 +363,7 @@
           <w:sz w:val="24"/>
           <w:szCs w:val="24"/>
         </w:rPr>
-        <w:t xml:space="preserve">2.  The precise regulatory position in Kerala (KSPCB current list, December 2025)</w:t>
+        <w:t xml:space="preserve">2.  The classification gap — Kerala vs. Tamil Nadu vs. the Central (CPCB) norm</w:t>
       </w:r>
     </w:p>
     <w:p>
@@ -494,27 +377,27 @@
           <w:sz w:val="22"/>
           <w:szCs w:val="22"/>
         </w:rPr>
-        <w:t xml:space="preserve">As per the Kerala State Pollution Control Board's current classification of industrial sectors, the coir process chain is placed as follows (reproduced in full at </w:t>
-      </w:r>
-      <w:r>
-        <w:rPr>
-          <w:rFonts w:ascii="Times New Roman" w:cs="Times New Roman" w:eastAsia="Times New Roman" w:hAnsi="Times New Roman"/>
-          <w:b/>
-          <w:bCs/>
-          <w:color w:val="1A1A1A"/>
-          <w:sz w:val="22"/>
-          <w:szCs w:val="22"/>
-        </w:rPr>
-        <w:t xml:space="preserve">Annexure A</w:t>
-      </w:r>
-      <w:r>
-        <w:rPr>
-          <w:rFonts w:ascii="Times New Roman" w:cs="Times New Roman" w:eastAsia="Times New Roman" w:hAnsi="Times New Roman"/>
-          <w:color w:val="1A1A1A"/>
-          <w:sz w:val="22"/>
-          <w:szCs w:val="22"/>
-        </w:rPr>
-        <w:t xml:space="preserve">):</w:t>
+        <w:t xml:space="preserve">The table below sets each coir activity against its category in Kerala (KSPCB), Tamil Nadu (TNPCB) and the Central norm (CPCB). The divergence is confined to the </w:t>
+      </w:r>
+      <w:r>
+        <w:rPr>
+          <w:rFonts w:ascii="Times New Roman" w:cs="Times New Roman" w:eastAsia="Times New Roman" w:hAnsi="Times New Roman"/>
+          <w:b/>
+          <w:bCs/>
+          <w:color w:val="1A1A1A"/>
+          <w:sz w:val="22"/>
+          <w:szCs w:val="22"/>
+        </w:rPr>
+        <w:t xml:space="preserve">primary end</w:t>
+      </w:r>
+      <w:r>
+        <w:rPr>
+          <w:rFonts w:ascii="Times New Roman" w:cs="Times New Roman" w:eastAsia="Times New Roman" w:hAnsi="Times New Roman"/>
+          <w:color w:val="1A1A1A"/>
+          <w:sz w:val="22"/>
+          <w:szCs w:val="22"/>
+        </w:rPr>
+        <w:t xml:space="preserve"> of the chain:</w:t>
       </w:r>
     </w:p>
     <w:tbl>
@@ -530,9 +413,11 @@
         </w:tblBorders>
       </w:tblPr>
       <w:tblGrid>
-        <w:gridCol w:w="3900"/>
-        <w:gridCol w:w="1900"/>
-        <w:gridCol w:w="3838"/>
+        <w:gridCol w:w="2760"/>
+        <w:gridCol w:w="1180"/>
+        <w:gridCol w:w="1180"/>
+        <w:gridCol w:w="1560"/>
+        <w:gridCol w:w="2958"/>
       </w:tblGrid>
       <w:tr>
         <w:trPr>
@@ -540,18 +425,18 @@
         </w:trPr>
         <w:tc>
           <w:tcPr>
-            <w:tcW w:type="dxa" w:w="3900"/>
+            <w:tcW w:type="dxa" w:w="2760"/>
             <w:shd w:fill="E9EFE9" w:color="auto" w:val="clear"/>
             <w:tcMar>
-              <w:top w:type="dxa" w:w="60"/>
-              <w:left w:type="dxa" w:w="100"/>
-              <w:bottom w:type="dxa" w:w="60"/>
-              <w:right w:type="dxa" w:w="100"/>
-            </w:tcMar>
-          </w:tcPr>
-          <w:p>
-            <w:pPr>
-              <w:spacing w:after="40" w:line="252"/>
+              <w:top w:type="dxa" w:w="50"/>
+              <w:left w:type="dxa" w:w="90"/>
+              <w:bottom w:type="dxa" w:w="50"/>
+              <w:right w:type="dxa" w:w="90"/>
+            </w:tcMar>
+          </w:tcPr>
+          <w:p>
+            <w:pPr>
+              <w:spacing w:after="30" w:line="248"/>
               <w:jc w:val="left"/>
             </w:pPr>
             <w:r>
@@ -563,24 +448,24 @@
                 <w:sz w:val="20"/>
                 <w:szCs w:val="20"/>
               </w:rPr>
-              <w:t xml:space="preserve">Coir process / activity</w:t>
-            </w:r>
-          </w:p>
-        </w:tc>
-        <w:tc>
-          <w:tcPr>
-            <w:tcW w:type="dxa" w:w="1900"/>
+              <w:t xml:space="preserve">Coir activity</w:t>
+            </w:r>
+          </w:p>
+        </w:tc>
+        <w:tc>
+          <w:tcPr>
+            <w:tcW w:type="dxa" w:w="1180"/>
             <w:shd w:fill="E9EFE9" w:color="auto" w:val="clear"/>
             <w:tcMar>
-              <w:top w:type="dxa" w:w="60"/>
-              <w:left w:type="dxa" w:w="100"/>
-              <w:bottom w:type="dxa" w:w="60"/>
-              <w:right w:type="dxa" w:w="100"/>
-            </w:tcMar>
-          </w:tcPr>
-          <w:p>
-            <w:pPr>
-              <w:spacing w:after="40" w:line="252"/>
+              <w:top w:type="dxa" w:w="50"/>
+              <w:left w:type="dxa" w:w="90"/>
+              <w:bottom w:type="dxa" w:w="50"/>
+              <w:right w:type="dxa" w:w="90"/>
+            </w:tcMar>
+          </w:tcPr>
+          <w:p>
+            <w:pPr>
+              <w:spacing w:after="30" w:line="248"/>
               <w:jc w:val="center"/>
             </w:pPr>
             <w:r>
@@ -592,25 +477,25 @@
                 <w:sz w:val="20"/>
                 <w:szCs w:val="20"/>
               </w:rPr>
-              <w:t xml:space="preserve">KSPCB category</w:t>
-            </w:r>
-          </w:p>
-        </w:tc>
-        <w:tc>
-          <w:tcPr>
-            <w:tcW w:type="dxa" w:w="3838"/>
+              <w:t xml:space="preserve">Kerala (KSPCB)</w:t>
+            </w:r>
+          </w:p>
+        </w:tc>
+        <w:tc>
+          <w:tcPr>
+            <w:tcW w:type="dxa" w:w="1180"/>
             <w:shd w:fill="E9EFE9" w:color="auto" w:val="clear"/>
             <w:tcMar>
-              <w:top w:type="dxa" w:w="60"/>
-              <w:left w:type="dxa" w:w="100"/>
-              <w:bottom w:type="dxa" w:w="60"/>
-              <w:right w:type="dxa" w:w="100"/>
-            </w:tcMar>
-          </w:tcPr>
-          <w:p>
-            <w:pPr>
-              <w:spacing w:after="40" w:line="252"/>
-              <w:jc w:val="left"/>
+              <w:top w:type="dxa" w:w="50"/>
+              <w:left w:type="dxa" w:w="90"/>
+              <w:bottom w:type="dxa" w:w="50"/>
+              <w:right w:type="dxa" w:w="90"/>
+            </w:tcMar>
+          </w:tcPr>
+          <w:p>
+            <w:pPr>
+              <w:spacing w:after="30" w:line="248"/>
+              <w:jc w:val="center"/>
             </w:pPr>
             <w:r>
               <w:rPr>
@@ -621,7 +506,65 @@
                 <w:sz w:val="20"/>
                 <w:szCs w:val="20"/>
               </w:rPr>
-              <w:t xml:space="preserve">Consent regime &amp; implication</w:t>
+              <w:t xml:space="preserve">Tamil Nadu (TNPCB)</w:t>
+            </w:r>
+          </w:p>
+        </w:tc>
+        <w:tc>
+          <w:tcPr>
+            <w:tcW w:type="dxa" w:w="1560"/>
+            <w:shd w:fill="E9EFE9" w:color="auto" w:val="clear"/>
+            <w:tcMar>
+              <w:top w:type="dxa" w:w="50"/>
+              <w:left w:type="dxa" w:w="90"/>
+              <w:bottom w:type="dxa" w:w="50"/>
+              <w:right w:type="dxa" w:w="90"/>
+            </w:tcMar>
+          </w:tcPr>
+          <w:p>
+            <w:pPr>
+              <w:spacing w:after="30" w:line="248"/>
+              <w:jc w:val="center"/>
+            </w:pPr>
+            <w:r>
+              <w:rPr>
+                <w:rFonts w:ascii="Times New Roman" w:cs="Times New Roman" w:eastAsia="Times New Roman" w:hAnsi="Times New Roman"/>
+                <w:b/>
+                <w:bCs/>
+                <w:color w:val="222222"/>
+                <w:sz w:val="20"/>
+                <w:szCs w:val="20"/>
+              </w:rPr>
+              <w:t xml:space="preserve">Central (CPCB)</w:t>
+            </w:r>
+          </w:p>
+        </w:tc>
+        <w:tc>
+          <w:tcPr>
+            <w:tcW w:type="dxa" w:w="2958"/>
+            <w:shd w:fill="E9EFE9" w:color="auto" w:val="clear"/>
+            <w:tcMar>
+              <w:top w:type="dxa" w:w="50"/>
+              <w:left w:type="dxa" w:w="90"/>
+              <w:bottom w:type="dxa" w:w="50"/>
+              <w:right w:type="dxa" w:w="90"/>
+            </w:tcMar>
+          </w:tcPr>
+          <w:p>
+            <w:pPr>
+              <w:spacing w:after="30" w:line="248"/>
+              <w:jc w:val="left"/>
+            </w:pPr>
+            <w:r>
+              <w:rPr>
+                <w:rFonts w:ascii="Times New Roman" w:cs="Times New Roman" w:eastAsia="Times New Roman" w:hAnsi="Times New Roman"/>
+                <w:b/>
+                <w:bCs/>
+                <w:color w:val="222222"/>
+                <w:sz w:val="20"/>
+                <w:szCs w:val="20"/>
+              </w:rPr>
+              <w:t xml:space="preserve">Where the outlier is</w:t>
             </w:r>
           </w:p>
         </w:tc>
@@ -629,17 +572,17 @@
       <w:tr>
         <w:tc>
           <w:tcPr>
-            <w:tcW w:type="dxa" w:w="3900"/>
-            <w:tcMar>
-              <w:top w:type="dxa" w:w="60"/>
-              <w:left w:type="dxa" w:w="100"/>
-              <w:bottom w:type="dxa" w:w="60"/>
-              <w:right w:type="dxa" w:w="100"/>
-            </w:tcMar>
-          </w:tcPr>
-          <w:p>
-            <w:pPr>
-              <w:spacing w:after="40" w:line="252"/>
+            <w:tcW w:type="dxa" w:w="2760"/>
+            <w:tcMar>
+              <w:top w:type="dxa" w:w="50"/>
+              <w:left w:type="dxa" w:w="90"/>
+              <w:bottom w:type="dxa" w:w="50"/>
+              <w:right w:type="dxa" w:w="90"/>
+            </w:tcMar>
+          </w:tcPr>
+          <w:p>
+            <w:pPr>
+              <w:spacing w:after="30" w:line="248"/>
               <w:jc w:val="left"/>
             </w:pPr>
             <w:r>
@@ -657,17 +600,18 @@
         </w:tc>
         <w:tc>
           <w:tcPr>
-            <w:tcW w:type="dxa" w:w="1900"/>
-            <w:tcMar>
-              <w:top w:type="dxa" w:w="60"/>
-              <w:left w:type="dxa" w:w="100"/>
-              <w:bottom w:type="dxa" w:w="60"/>
-              <w:right w:type="dxa" w:w="100"/>
-            </w:tcMar>
-          </w:tcPr>
-          <w:p>
-            <w:pPr>
-              <w:spacing w:after="40" w:line="252"/>
+            <w:tcW w:type="dxa" w:w="1180"/>
+            <w:tcMar>
+              <w:top w:type="dxa" w:w="50"/>
+              <w:left w:type="dxa" w:w="90"/>
+              <w:bottom w:type="dxa" w:w="50"/>
+              <w:right w:type="dxa" w:w="90"/>
+            </w:tcMar>
+          </w:tcPr>
+          <w:p>
+            <w:pPr>
+              <w:spacing w:after="30" w:line="248"/>
+              <w:jc w:val="center"/>
             </w:pPr>
             <w:r>
               <w:rPr>
@@ -684,17 +628,103 @@
         </w:tc>
         <w:tc>
           <w:tcPr>
-            <w:tcW w:type="dxa" w:w="3838"/>
-            <w:tcMar>
-              <w:top w:type="dxa" w:w="60"/>
-              <w:left w:type="dxa" w:w="100"/>
-              <w:bottom w:type="dxa" w:w="60"/>
-              <w:right w:type="dxa" w:w="100"/>
-            </w:tcMar>
-          </w:tcPr>
-          <w:p>
-            <w:pPr>
-              <w:spacing w:after="40" w:line="252"/>
+            <w:tcW w:type="dxa" w:w="1180"/>
+            <w:tcMar>
+              <w:top w:type="dxa" w:w="50"/>
+              <w:left w:type="dxa" w:w="90"/>
+              <w:bottom w:type="dxa" w:w="50"/>
+              <w:right w:type="dxa" w:w="90"/>
+            </w:tcMar>
+          </w:tcPr>
+          <w:p>
+            <w:pPr>
+              <w:spacing w:after="30" w:line="248"/>
+              <w:jc w:val="center"/>
+            </w:pPr>
+            <w:r>
+              <w:rPr>
+                <w:rFonts w:ascii="Times New Roman" w:cs="Times New Roman" w:eastAsia="Times New Roman" w:hAnsi="Times New Roman"/>
+                <w:b/>
+                <w:bCs/>
+                <w:color w:val="444444"/>
+                <w:sz w:val="20"/>
+                <w:szCs w:val="20"/>
+              </w:rPr>
+              <w:t xml:space="preserve">WHITE</w:t>
+            </w:r>
+          </w:p>
+        </w:tc>
+        <w:tc>
+          <w:tcPr>
+            <w:tcW w:type="dxa" w:w="1560"/>
+            <w:tcMar>
+              <w:top w:type="dxa" w:w="50"/>
+              <w:left w:type="dxa" w:w="90"/>
+              <w:bottom w:type="dxa" w:w="50"/>
+              <w:right w:type="dxa" w:w="90"/>
+            </w:tcMar>
+          </w:tcPr>
+          <w:p>
+            <w:pPr>
+              <w:spacing w:after="30" w:line="248"/>
+              <w:jc w:val="center"/>
+            </w:pPr>
+            <w:r>
+              <w:rPr>
+                <w:rFonts w:ascii="Times New Roman" w:cs="Times New Roman" w:eastAsia="Times New Roman" w:hAnsi="Times New Roman"/>
+                <w:b/>
+                <w:bCs/>
+                <w:color w:val="1E7D1E"/>
+                <w:sz w:val="20"/>
+                <w:szCs w:val="20"/>
+              </w:rPr>
+              <w:t xml:space="preserve">Not a Red / Orange sector †</w:t>
+            </w:r>
+          </w:p>
+        </w:tc>
+        <w:tc>
+          <w:tcPr>
+            <w:tcW w:type="dxa" w:w="2958"/>
+            <w:tcMar>
+              <w:top w:type="dxa" w:w="50"/>
+              <w:left w:type="dxa" w:w="90"/>
+              <w:bottom w:type="dxa" w:w="50"/>
+              <w:right w:type="dxa" w:w="90"/>
+            </w:tcMar>
+          </w:tcPr>
+          <w:p>
+            <w:pPr>
+              <w:spacing w:after="30" w:line="248"/>
+              <w:jc w:val="left"/>
+            </w:pPr>
+            <w:r>
+              <w:rPr>
+                <w:rFonts w:ascii="Times New Roman" w:cs="Times New Roman" w:eastAsia="Times New Roman" w:hAnsi="Times New Roman"/>
+                <w:b/>
+                <w:bCs/>
+                <w:color w:val="8A3324"/>
+                <w:sz w:val="20"/>
+                <w:szCs w:val="20"/>
+              </w:rPr>
+              <w:t xml:space="preserve">Kerala alone — Red vs. White elsewhere</w:t>
+            </w:r>
+          </w:p>
+        </w:tc>
+      </w:tr>
+      <w:tr>
+        <w:tc>
+          <w:tcPr>
+            <w:tcW w:type="dxa" w:w="2760"/>
+            <w:tcMar>
+              <w:top w:type="dxa" w:w="50"/>
+              <w:left w:type="dxa" w:w="90"/>
+              <w:bottom w:type="dxa" w:w="50"/>
+              <w:right w:type="dxa" w:w="90"/>
+            </w:tcMar>
+          </w:tcPr>
+          <w:p>
+            <w:pPr>
+              <w:spacing w:after="30" w:line="248"/>
               <w:jc w:val="left"/>
             </w:pPr>
             <w:r>
@@ -706,53 +736,24 @@
                 <w:sz w:val="20"/>
                 <w:szCs w:val="20"/>
               </w:rPr>
-              <w:t xml:space="preserve">Highest scrutiny — full Consent to Establish (CTE) and Consent to Operate (CTO); can attract public-hearing-tier appraisal.</w:t>
-            </w:r>
-          </w:p>
-        </w:tc>
-      </w:tr>
-      <w:tr>
-        <w:tc>
-          <w:tcPr>
-            <w:tcW w:type="dxa" w:w="3900"/>
-            <w:tcMar>
-              <w:top w:type="dxa" w:w="60"/>
-              <w:left w:type="dxa" w:w="100"/>
-              <w:bottom w:type="dxa" w:w="60"/>
-              <w:right w:type="dxa" w:w="100"/>
-            </w:tcMar>
-          </w:tcPr>
-          <w:p>
-            <w:pPr>
-              <w:spacing w:after="40" w:line="252"/>
-              <w:jc w:val="left"/>
-            </w:pPr>
-            <w:r>
-              <w:rPr>
-                <w:rFonts w:ascii="Times New Roman" w:cs="Times New Roman" w:eastAsia="Times New Roman" w:hAnsi="Times New Roman"/>
-                <w:b w:val="false"/>
-                <w:bCs w:val="false"/>
-                <w:color w:val="1A1A1A"/>
-                <w:sz w:val="20"/>
-                <w:szCs w:val="20"/>
-              </w:rPr>
-              <w:t xml:space="preserve">Coir de-fibring / ginning; coir stencilling; coir bleaching / dyeing</w:t>
-            </w:r>
-          </w:p>
-        </w:tc>
-        <w:tc>
-          <w:tcPr>
-            <w:tcW w:type="dxa" w:w="1900"/>
-            <w:tcMar>
-              <w:top w:type="dxa" w:w="60"/>
-              <w:left w:type="dxa" w:w="100"/>
-              <w:bottom w:type="dxa" w:w="60"/>
-              <w:right w:type="dxa" w:w="100"/>
-            </w:tcMar>
-          </w:tcPr>
-          <w:p>
-            <w:pPr>
-              <w:spacing w:after="40" w:line="252"/>
+              <w:t xml:space="preserve">Coir de-fibring / ginning</w:t>
+            </w:r>
+          </w:p>
+        </w:tc>
+        <w:tc>
+          <w:tcPr>
+            <w:tcW w:type="dxa" w:w="1180"/>
+            <w:tcMar>
+              <w:top w:type="dxa" w:w="50"/>
+              <w:left w:type="dxa" w:w="90"/>
+              <w:bottom w:type="dxa" w:w="50"/>
+              <w:right w:type="dxa" w:w="90"/>
+            </w:tcMar>
+          </w:tcPr>
+          <w:p>
+            <w:pPr>
+              <w:spacing w:after="30" w:line="248"/>
+              <w:jc w:val="center"/>
             </w:pPr>
             <w:r>
               <w:rPr>
@@ -769,75 +770,46 @@
         </w:tc>
         <w:tc>
           <w:tcPr>
-            <w:tcW w:type="dxa" w:w="3838"/>
-            <w:tcMar>
-              <w:top w:type="dxa" w:w="60"/>
-              <w:left w:type="dxa" w:w="100"/>
-              <w:bottom w:type="dxa" w:w="60"/>
-              <w:right w:type="dxa" w:w="100"/>
-            </w:tcMar>
-          </w:tcPr>
-          <w:p>
-            <w:pPr>
-              <w:spacing w:after="40" w:line="252"/>
-              <w:jc w:val="left"/>
-            </w:pPr>
-            <w:r>
-              <w:rPr>
-                <w:rFonts w:ascii="Times New Roman" w:cs="Times New Roman" w:eastAsia="Times New Roman" w:hAnsi="Times New Roman"/>
-                <w:b w:val="false"/>
-                <w:bCs w:val="false"/>
-                <w:color w:val="1A1A1A"/>
-                <w:sz w:val="20"/>
-                <w:szCs w:val="20"/>
-              </w:rPr>
-              <w:t xml:space="preserve">Full CTE and CTO required, with periodic monitoring.</w:t>
-            </w:r>
-          </w:p>
-        </w:tc>
-      </w:tr>
-      <w:tr>
-        <w:tc>
-          <w:tcPr>
-            <w:tcW w:type="dxa" w:w="3900"/>
-            <w:tcMar>
-              <w:top w:type="dxa" w:w="60"/>
-              <w:left w:type="dxa" w:w="100"/>
-              <w:bottom w:type="dxa" w:w="60"/>
-              <w:right w:type="dxa" w:w="100"/>
-            </w:tcMar>
-          </w:tcPr>
-          <w:p>
-            <w:pPr>
-              <w:spacing w:after="40" w:line="252"/>
-              <w:jc w:val="left"/>
-            </w:pPr>
-            <w:r>
-              <w:rPr>
-                <w:rFonts w:ascii="Times New Roman" w:cs="Times New Roman" w:eastAsia="Times New Roman" w:hAnsi="Times New Roman"/>
-                <w:b w:val="false"/>
-                <w:bCs w:val="false"/>
-                <w:color w:val="1A1A1A"/>
-                <w:sz w:val="20"/>
-                <w:szCs w:val="20"/>
-              </w:rPr>
-              <w:t xml:space="preserve">Coir fibre / pith processing generating effluent</w:t>
-            </w:r>
-          </w:p>
-        </w:tc>
-        <w:tc>
-          <w:tcPr>
-            <w:tcW w:type="dxa" w:w="1900"/>
-            <w:tcMar>
-              <w:top w:type="dxa" w:w="60"/>
-              <w:left w:type="dxa" w:w="100"/>
-              <w:bottom w:type="dxa" w:w="60"/>
-              <w:right w:type="dxa" w:w="100"/>
-            </w:tcMar>
-          </w:tcPr>
-          <w:p>
-            <w:pPr>
-              <w:spacing w:after="40" w:line="252"/>
+            <w:tcW w:type="dxa" w:w="1180"/>
+            <w:tcMar>
+              <w:top w:type="dxa" w:w="50"/>
+              <w:left w:type="dxa" w:w="90"/>
+              <w:bottom w:type="dxa" w:w="50"/>
+              <w:right w:type="dxa" w:w="90"/>
+            </w:tcMar>
+          </w:tcPr>
+          <w:p>
+            <w:pPr>
+              <w:spacing w:after="30" w:line="248"/>
+              <w:jc w:val="center"/>
+            </w:pPr>
+            <w:r>
+              <w:rPr>
+                <w:rFonts w:ascii="Times New Roman" w:cs="Times New Roman" w:eastAsia="Times New Roman" w:hAnsi="Times New Roman"/>
+                <w:b/>
+                <w:bCs/>
+                <w:color w:val="444444"/>
+                <w:sz w:val="20"/>
+                <w:szCs w:val="20"/>
+              </w:rPr>
+              <w:t xml:space="preserve">WHITE</w:t>
+            </w:r>
+          </w:p>
+        </w:tc>
+        <w:tc>
+          <w:tcPr>
+            <w:tcW w:type="dxa" w:w="1560"/>
+            <w:tcMar>
+              <w:top w:type="dxa" w:w="50"/>
+              <w:left w:type="dxa" w:w="90"/>
+              <w:bottom w:type="dxa" w:w="50"/>
+              <w:right w:type="dxa" w:w="90"/>
+            </w:tcMar>
+          </w:tcPr>
+          <w:p>
+            <w:pPr>
+              <w:spacing w:after="30" w:line="248"/>
+              <w:jc w:val="center"/>
             </w:pPr>
             <w:r>
               <w:rPr>
@@ -848,23 +820,53 @@
                 <w:sz w:val="20"/>
                 <w:szCs w:val="20"/>
               </w:rPr>
-              <w:t xml:space="preserve">GREEN</w:t>
-            </w:r>
-          </w:p>
-        </w:tc>
-        <w:tc>
-          <w:tcPr>
-            <w:tcW w:type="dxa" w:w="3838"/>
-            <w:tcMar>
-              <w:top w:type="dxa" w:w="60"/>
-              <w:left w:type="dxa" w:w="100"/>
-              <w:bottom w:type="dxa" w:w="60"/>
-              <w:right w:type="dxa" w:w="100"/>
-            </w:tcMar>
-          </w:tcPr>
-          <w:p>
-            <w:pPr>
-              <w:spacing w:after="40" w:line="252"/>
+              <w:t xml:space="preserve">White / Green (dry) †</w:t>
+            </w:r>
+          </w:p>
+        </w:tc>
+        <w:tc>
+          <w:tcPr>
+            <w:tcW w:type="dxa" w:w="2958"/>
+            <w:tcMar>
+              <w:top w:type="dxa" w:w="50"/>
+              <w:left w:type="dxa" w:w="90"/>
+              <w:bottom w:type="dxa" w:w="50"/>
+              <w:right w:type="dxa" w:w="90"/>
+            </w:tcMar>
+          </w:tcPr>
+          <w:p>
+            <w:pPr>
+              <w:spacing w:after="30" w:line="248"/>
+              <w:jc w:val="left"/>
+            </w:pPr>
+            <w:r>
+              <w:rPr>
+                <w:rFonts w:ascii="Times New Roman" w:cs="Times New Roman" w:eastAsia="Times New Roman" w:hAnsi="Times New Roman"/>
+                <w:b/>
+                <w:bCs/>
+                <w:color w:val="8A3324"/>
+                <w:sz w:val="20"/>
+                <w:szCs w:val="20"/>
+              </w:rPr>
+              <w:t xml:space="preserve">Kerala alone — Orange vs. White elsewhere</w:t>
+            </w:r>
+          </w:p>
+        </w:tc>
+      </w:tr>
+      <w:tr>
+        <w:tc>
+          <w:tcPr>
+            <w:tcW w:type="dxa" w:w="2760"/>
+            <w:tcMar>
+              <w:top w:type="dxa" w:w="50"/>
+              <w:left w:type="dxa" w:w="90"/>
+              <w:bottom w:type="dxa" w:w="50"/>
+              <w:right w:type="dxa" w:w="90"/>
+            </w:tcMar>
+          </w:tcPr>
+          <w:p>
+            <w:pPr>
+              <w:spacing w:after="30" w:line="248"/>
               <w:jc w:val="left"/>
             </w:pPr>
             <w:r>
@@ -876,53 +878,52 @@
                 <w:sz w:val="20"/>
                 <w:szCs w:val="20"/>
               </w:rPr>
-              <w:t xml:space="preserve">Simplified consent regime.</w:t>
-            </w:r>
-          </w:p>
-        </w:tc>
-      </w:tr>
-      <w:tr>
-        <w:tc>
-          <w:tcPr>
-            <w:tcW w:type="dxa" w:w="3900"/>
-            <w:tcMar>
-              <w:top w:type="dxa" w:w="60"/>
-              <w:left w:type="dxa" w:w="100"/>
-              <w:bottom w:type="dxa" w:w="60"/>
-              <w:right w:type="dxa" w:w="100"/>
-            </w:tcMar>
-          </w:tcPr>
-          <w:p>
-            <w:pPr>
-              <w:spacing w:after="40" w:line="252"/>
-              <w:jc w:val="left"/>
-            </w:pPr>
-            <w:r>
-              <w:rPr>
-                <w:rFonts w:ascii="Times New Roman" w:cs="Times New Roman" w:eastAsia="Times New Roman" w:hAnsi="Times New Roman"/>
-                <w:b w:val="false"/>
-                <w:bCs w:val="false"/>
-                <w:color w:val="1A1A1A"/>
-                <w:sz w:val="20"/>
-                <w:szCs w:val="20"/>
-              </w:rPr>
-              <w:t xml:space="preserve">Dry coir processing / coir products without effluent; coir yarn without dyeing; coir-pith final product; coir rope; curled coir</w:t>
-            </w:r>
-          </w:p>
-        </w:tc>
-        <w:tc>
-          <w:tcPr>
-            <w:tcW w:type="dxa" w:w="1900"/>
-            <w:tcMar>
-              <w:top w:type="dxa" w:w="60"/>
-              <w:left w:type="dxa" w:w="100"/>
-              <w:bottom w:type="dxa" w:w="60"/>
-              <w:right w:type="dxa" w:w="100"/>
-            </w:tcMar>
-          </w:tcPr>
-          <w:p>
-            <w:pPr>
-              <w:spacing w:after="40" w:line="252"/>
+              <w:t xml:space="preserve">Coir fibre / pith processing generating effluent</w:t>
+            </w:r>
+          </w:p>
+        </w:tc>
+        <w:tc>
+          <w:tcPr>
+            <w:tcW w:type="dxa" w:w="1180"/>
+            <w:tcMar>
+              <w:top w:type="dxa" w:w="50"/>
+              <w:left w:type="dxa" w:w="90"/>
+              <w:bottom w:type="dxa" w:w="50"/>
+              <w:right w:type="dxa" w:w="90"/>
+            </w:tcMar>
+          </w:tcPr>
+          <w:p>
+            <w:pPr>
+              <w:spacing w:after="30" w:line="248"/>
+              <w:jc w:val="center"/>
+            </w:pPr>
+            <w:r>
+              <w:rPr>
+                <w:rFonts w:ascii="Times New Roman" w:cs="Times New Roman" w:eastAsia="Times New Roman" w:hAnsi="Times New Roman"/>
+                <w:b/>
+                <w:bCs/>
+                <w:color w:val="1E7D1E"/>
+                <w:sz w:val="20"/>
+                <w:szCs w:val="20"/>
+              </w:rPr>
+              <w:t xml:space="preserve">GREEN</w:t>
+            </w:r>
+          </w:p>
+        </w:tc>
+        <w:tc>
+          <w:tcPr>
+            <w:tcW w:type="dxa" w:w="1180"/>
+            <w:tcMar>
+              <w:top w:type="dxa" w:w="50"/>
+              <w:left w:type="dxa" w:w="90"/>
+              <w:bottom w:type="dxa" w:w="50"/>
+              <w:right w:type="dxa" w:w="90"/>
+            </w:tcMar>
+          </w:tcPr>
+          <w:p>
+            <w:pPr>
+              <w:spacing w:after="30" w:line="248"/>
+              <w:jc w:val="center"/>
             </w:pPr>
             <w:r>
               <w:rPr>
@@ -939,17 +940,75 @@
         </w:tc>
         <w:tc>
           <w:tcPr>
-            <w:tcW w:type="dxa" w:w="3838"/>
-            <w:tcMar>
-              <w:top w:type="dxa" w:w="60"/>
-              <w:left w:type="dxa" w:w="100"/>
-              <w:bottom w:type="dxa" w:w="60"/>
-              <w:right w:type="dxa" w:w="100"/>
-            </w:tcMar>
-          </w:tcPr>
-          <w:p>
-            <w:pPr>
-              <w:spacing w:after="40" w:line="252"/>
+            <w:tcW w:type="dxa" w:w="1560"/>
+            <w:tcMar>
+              <w:top w:type="dxa" w:w="50"/>
+              <w:left w:type="dxa" w:w="90"/>
+              <w:bottom w:type="dxa" w:w="50"/>
+              <w:right w:type="dxa" w:w="90"/>
+            </w:tcMar>
+          </w:tcPr>
+          <w:p>
+            <w:pPr>
+              <w:spacing w:after="30" w:line="248"/>
+              <w:jc w:val="center"/>
+            </w:pPr>
+            <w:r>
+              <w:rPr>
+                <w:rFonts w:ascii="Times New Roman" w:cs="Times New Roman" w:eastAsia="Times New Roman" w:hAnsi="Times New Roman"/>
+                <w:b/>
+                <w:bCs/>
+                <w:color w:val="1E7D1E"/>
+                <w:sz w:val="20"/>
+                <w:szCs w:val="20"/>
+              </w:rPr>
+              <w:t xml:space="preserve">GREEN</w:t>
+            </w:r>
+          </w:p>
+        </w:tc>
+        <w:tc>
+          <w:tcPr>
+            <w:tcW w:type="dxa" w:w="2958"/>
+            <w:tcMar>
+              <w:top w:type="dxa" w:w="50"/>
+              <w:left w:type="dxa" w:w="90"/>
+              <w:bottom w:type="dxa" w:w="50"/>
+              <w:right w:type="dxa" w:w="90"/>
+            </w:tcMar>
+          </w:tcPr>
+          <w:p>
+            <w:pPr>
+              <w:spacing w:after="30" w:line="248"/>
+              <w:jc w:val="left"/>
+            </w:pPr>
+            <w:r>
+              <w:rPr>
+                <w:rFonts w:ascii="Times New Roman" w:cs="Times New Roman" w:eastAsia="Times New Roman" w:hAnsi="Times New Roman"/>
+                <w:b/>
+                <w:bCs/>
+                <w:color w:val="555555"/>
+                <w:sz w:val="20"/>
+                <w:szCs w:val="20"/>
+              </w:rPr>
+              <w:t xml:space="preserve">Kerala &amp; CPCB stricter than TN</w:t>
+            </w:r>
+          </w:p>
+        </w:tc>
+      </w:tr>
+      <w:tr>
+        <w:tc>
+          <w:tcPr>
+            <w:tcW w:type="dxa" w:w="2760"/>
+            <w:tcMar>
+              <w:top w:type="dxa" w:w="50"/>
+              <w:left w:type="dxa" w:w="90"/>
+              <w:bottom w:type="dxa" w:w="50"/>
+              <w:right w:type="dxa" w:w="90"/>
+            </w:tcMar>
+          </w:tcPr>
+          <w:p>
+            <w:pPr>
+              <w:spacing w:after="30" w:line="248"/>
               <w:jc w:val="left"/>
             </w:pPr>
             <w:r>
@@ -961,7 +1020,545 @@
                 <w:sz w:val="20"/>
                 <w:szCs w:val="20"/>
               </w:rPr>
-              <w:t xml:space="preserve">Practically non-polluting; no Consent to Operate — a simple intimation to KSPCB suffices.</w:t>
+              <w:t xml:space="preserve">Coir bleaching / dyeing / stencilling (chemical, wet)</w:t>
+            </w:r>
+          </w:p>
+        </w:tc>
+        <w:tc>
+          <w:tcPr>
+            <w:tcW w:type="dxa" w:w="1180"/>
+            <w:tcMar>
+              <w:top w:type="dxa" w:w="50"/>
+              <w:left w:type="dxa" w:w="90"/>
+              <w:bottom w:type="dxa" w:w="50"/>
+              <w:right w:type="dxa" w:w="90"/>
+            </w:tcMar>
+          </w:tcPr>
+          <w:p>
+            <w:pPr>
+              <w:spacing w:after="30" w:line="248"/>
+              <w:jc w:val="center"/>
+            </w:pPr>
+            <w:r>
+              <w:rPr>
+                <w:rFonts w:ascii="Times New Roman" w:cs="Times New Roman" w:eastAsia="Times New Roman" w:hAnsi="Times New Roman"/>
+                <w:b/>
+                <w:bCs/>
+                <w:color w:val="C87A00"/>
+                <w:sz w:val="20"/>
+                <w:szCs w:val="20"/>
+              </w:rPr>
+              <w:t xml:space="preserve">ORANGE</w:t>
+            </w:r>
+          </w:p>
+        </w:tc>
+        <w:tc>
+          <w:tcPr>
+            <w:tcW w:type="dxa" w:w="1180"/>
+            <w:tcMar>
+              <w:top w:type="dxa" w:w="50"/>
+              <w:left w:type="dxa" w:w="90"/>
+              <w:bottom w:type="dxa" w:w="50"/>
+              <w:right w:type="dxa" w:w="90"/>
+            </w:tcMar>
+          </w:tcPr>
+          <w:p>
+            <w:pPr>
+              <w:spacing w:after="30" w:line="248"/>
+              <w:jc w:val="center"/>
+            </w:pPr>
+            <w:r>
+              <w:rPr>
+                <w:rFonts w:ascii="Times New Roman" w:cs="Times New Roman" w:eastAsia="Times New Roman" w:hAnsi="Times New Roman"/>
+                <w:b/>
+                <w:bCs/>
+                <w:color w:val="444444"/>
+                <w:sz w:val="20"/>
+                <w:szCs w:val="20"/>
+              </w:rPr>
+              <w:t xml:space="preserve">WHITE</w:t>
+            </w:r>
+          </w:p>
+        </w:tc>
+        <w:tc>
+          <w:tcPr>
+            <w:tcW w:type="dxa" w:w="1560"/>
+            <w:tcMar>
+              <w:top w:type="dxa" w:w="50"/>
+              <w:left w:type="dxa" w:w="90"/>
+              <w:bottom w:type="dxa" w:w="50"/>
+              <w:right w:type="dxa" w:w="90"/>
+            </w:tcMar>
+          </w:tcPr>
+          <w:p>
+            <w:pPr>
+              <w:spacing w:after="30" w:line="248"/>
+              <w:jc w:val="center"/>
+            </w:pPr>
+            <w:r>
+              <w:rPr>
+                <w:rFonts w:ascii="Times New Roman" w:cs="Times New Roman" w:eastAsia="Times New Roman" w:hAnsi="Times New Roman"/>
+                <w:b/>
+                <w:bCs/>
+                <w:color w:val="C87A00"/>
+                <w:sz w:val="20"/>
+                <w:szCs w:val="20"/>
+              </w:rPr>
+              <w:t xml:space="preserve">ORANGE</w:t>
+            </w:r>
+          </w:p>
+        </w:tc>
+        <w:tc>
+          <w:tcPr>
+            <w:tcW w:type="dxa" w:w="2958"/>
+            <w:tcMar>
+              <w:top w:type="dxa" w:w="50"/>
+              <w:left w:type="dxa" w:w="90"/>
+              <w:bottom w:type="dxa" w:w="50"/>
+              <w:right w:type="dxa" w:w="90"/>
+            </w:tcMar>
+          </w:tcPr>
+          <w:p>
+            <w:pPr>
+              <w:spacing w:after="30" w:line="248"/>
+              <w:jc w:val="left"/>
+            </w:pPr>
+            <w:r>
+              <w:rPr>
+                <w:rFonts w:ascii="Times New Roman" w:cs="Times New Roman" w:eastAsia="Times New Roman" w:hAnsi="Times New Roman"/>
+                <w:b/>
+                <w:bCs/>
+                <w:color w:val="555555"/>
+                <w:sz w:val="20"/>
+                <w:szCs w:val="20"/>
+              </w:rPr>
+              <w:t xml:space="preserve">Kerala aligned with CPCB</w:t>
+            </w:r>
+          </w:p>
+        </w:tc>
+      </w:tr>
+      <w:tr>
+        <w:tc>
+          <w:tcPr>
+            <w:tcW w:type="dxa" w:w="2760"/>
+            <w:tcMar>
+              <w:top w:type="dxa" w:w="50"/>
+              <w:left w:type="dxa" w:w="90"/>
+              <w:bottom w:type="dxa" w:w="50"/>
+              <w:right w:type="dxa" w:w="90"/>
+            </w:tcMar>
+          </w:tcPr>
+          <w:p>
+            <w:pPr>
+              <w:spacing w:after="30" w:line="248"/>
+              <w:jc w:val="left"/>
+            </w:pPr>
+            <w:r>
+              <w:rPr>
+                <w:rFonts w:ascii="Times New Roman" w:cs="Times New Roman" w:eastAsia="Times New Roman" w:hAnsi="Times New Roman"/>
+                <w:b w:val="false"/>
+                <w:bCs w:val="false"/>
+                <w:color w:val="1A1A1A"/>
+                <w:sz w:val="20"/>
+                <w:szCs w:val="20"/>
+              </w:rPr>
+              <w:t xml:space="preserve">Dry coir processing / coir products without effluent</w:t>
+            </w:r>
+          </w:p>
+        </w:tc>
+        <w:tc>
+          <w:tcPr>
+            <w:tcW w:type="dxa" w:w="1180"/>
+            <w:tcMar>
+              <w:top w:type="dxa" w:w="50"/>
+              <w:left w:type="dxa" w:w="90"/>
+              <w:bottom w:type="dxa" w:w="50"/>
+              <w:right w:type="dxa" w:w="90"/>
+            </w:tcMar>
+          </w:tcPr>
+          <w:p>
+            <w:pPr>
+              <w:spacing w:after="30" w:line="248"/>
+              <w:jc w:val="center"/>
+            </w:pPr>
+            <w:r>
+              <w:rPr>
+                <w:rFonts w:ascii="Times New Roman" w:cs="Times New Roman" w:eastAsia="Times New Roman" w:hAnsi="Times New Roman"/>
+                <w:b/>
+                <w:bCs/>
+                <w:color w:val="444444"/>
+                <w:sz w:val="20"/>
+                <w:szCs w:val="20"/>
+              </w:rPr>
+              <w:t xml:space="preserve">WHITE</w:t>
+            </w:r>
+          </w:p>
+        </w:tc>
+        <w:tc>
+          <w:tcPr>
+            <w:tcW w:type="dxa" w:w="1180"/>
+            <w:tcMar>
+              <w:top w:type="dxa" w:w="50"/>
+              <w:left w:type="dxa" w:w="90"/>
+              <w:bottom w:type="dxa" w:w="50"/>
+              <w:right w:type="dxa" w:w="90"/>
+            </w:tcMar>
+          </w:tcPr>
+          <w:p>
+            <w:pPr>
+              <w:spacing w:after="30" w:line="248"/>
+              <w:jc w:val="center"/>
+            </w:pPr>
+            <w:r>
+              <w:rPr>
+                <w:rFonts w:ascii="Times New Roman" w:cs="Times New Roman" w:eastAsia="Times New Roman" w:hAnsi="Times New Roman"/>
+                <w:b/>
+                <w:bCs/>
+                <w:color w:val="444444"/>
+                <w:sz w:val="20"/>
+                <w:szCs w:val="20"/>
+              </w:rPr>
+              <w:t xml:space="preserve">WHITE</w:t>
+            </w:r>
+          </w:p>
+        </w:tc>
+        <w:tc>
+          <w:tcPr>
+            <w:tcW w:type="dxa" w:w="1560"/>
+            <w:tcMar>
+              <w:top w:type="dxa" w:w="50"/>
+              <w:left w:type="dxa" w:w="90"/>
+              <w:bottom w:type="dxa" w:w="50"/>
+              <w:right w:type="dxa" w:w="90"/>
+            </w:tcMar>
+          </w:tcPr>
+          <w:p>
+            <w:pPr>
+              <w:spacing w:after="30" w:line="248"/>
+              <w:jc w:val="center"/>
+            </w:pPr>
+            <w:r>
+              <w:rPr>
+                <w:rFonts w:ascii="Times New Roman" w:cs="Times New Roman" w:eastAsia="Times New Roman" w:hAnsi="Times New Roman"/>
+                <w:b/>
+                <w:bCs/>
+                <w:color w:val="444444"/>
+                <w:sz w:val="20"/>
+                <w:szCs w:val="20"/>
+              </w:rPr>
+              <w:t xml:space="preserve">WHITE</w:t>
+            </w:r>
+          </w:p>
+        </w:tc>
+        <w:tc>
+          <w:tcPr>
+            <w:tcW w:type="dxa" w:w="2958"/>
+            <w:tcMar>
+              <w:top w:type="dxa" w:w="50"/>
+              <w:left w:type="dxa" w:w="90"/>
+              <w:bottom w:type="dxa" w:w="50"/>
+              <w:right w:type="dxa" w:w="90"/>
+            </w:tcMar>
+          </w:tcPr>
+          <w:p>
+            <w:pPr>
+              <w:spacing w:after="30" w:line="248"/>
+              <w:jc w:val="left"/>
+            </w:pPr>
+            <w:r>
+              <w:rPr>
+                <w:rFonts w:ascii="Times New Roman" w:cs="Times New Roman" w:eastAsia="Times New Roman" w:hAnsi="Times New Roman"/>
+                <w:b/>
+                <w:bCs/>
+                <w:color w:val="555555"/>
+                <w:sz w:val="20"/>
+                <w:szCs w:val="20"/>
+              </w:rPr>
+              <w:t xml:space="preserve">Fully aligned</w:t>
+            </w:r>
+          </w:p>
+        </w:tc>
+      </w:tr>
+      <w:tr>
+        <w:tc>
+          <w:tcPr>
+            <w:tcW w:type="dxa" w:w="2760"/>
+            <w:tcMar>
+              <w:top w:type="dxa" w:w="50"/>
+              <w:left w:type="dxa" w:w="90"/>
+              <w:bottom w:type="dxa" w:w="50"/>
+              <w:right w:type="dxa" w:w="90"/>
+            </w:tcMar>
+          </w:tcPr>
+          <w:p>
+            <w:pPr>
+              <w:spacing w:after="30" w:line="248"/>
+              <w:jc w:val="left"/>
+            </w:pPr>
+            <w:r>
+              <w:rPr>
+                <w:rFonts w:ascii="Times New Roman" w:cs="Times New Roman" w:eastAsia="Times New Roman" w:hAnsi="Times New Roman"/>
+                <w:b w:val="false"/>
+                <w:bCs w:val="false"/>
+                <w:color w:val="1A1A1A"/>
+                <w:sz w:val="20"/>
+                <w:szCs w:val="20"/>
+              </w:rPr>
+              <w:t xml:space="preserve">Coir yarn without dyeing</w:t>
+            </w:r>
+          </w:p>
+        </w:tc>
+        <w:tc>
+          <w:tcPr>
+            <w:tcW w:type="dxa" w:w="1180"/>
+            <w:tcMar>
+              <w:top w:type="dxa" w:w="50"/>
+              <w:left w:type="dxa" w:w="90"/>
+              <w:bottom w:type="dxa" w:w="50"/>
+              <w:right w:type="dxa" w:w="90"/>
+            </w:tcMar>
+          </w:tcPr>
+          <w:p>
+            <w:pPr>
+              <w:spacing w:after="30" w:line="248"/>
+              <w:jc w:val="center"/>
+            </w:pPr>
+            <w:r>
+              <w:rPr>
+                <w:rFonts w:ascii="Times New Roman" w:cs="Times New Roman" w:eastAsia="Times New Roman" w:hAnsi="Times New Roman"/>
+                <w:b/>
+                <w:bCs/>
+                <w:color w:val="444444"/>
+                <w:sz w:val="20"/>
+                <w:szCs w:val="20"/>
+              </w:rPr>
+              <w:t xml:space="preserve">WHITE</w:t>
+            </w:r>
+          </w:p>
+        </w:tc>
+        <w:tc>
+          <w:tcPr>
+            <w:tcW w:type="dxa" w:w="1180"/>
+            <w:tcMar>
+              <w:top w:type="dxa" w:w="50"/>
+              <w:left w:type="dxa" w:w="90"/>
+              <w:bottom w:type="dxa" w:w="50"/>
+              <w:right w:type="dxa" w:w="90"/>
+            </w:tcMar>
+          </w:tcPr>
+          <w:p>
+            <w:pPr>
+              <w:spacing w:after="30" w:line="248"/>
+              <w:jc w:val="center"/>
+            </w:pPr>
+            <w:r>
+              <w:rPr>
+                <w:rFonts w:ascii="Times New Roman" w:cs="Times New Roman" w:eastAsia="Times New Roman" w:hAnsi="Times New Roman"/>
+                <w:b/>
+                <w:bCs/>
+                <w:color w:val="444444"/>
+                <w:sz w:val="20"/>
+                <w:szCs w:val="20"/>
+              </w:rPr>
+              <w:t xml:space="preserve">WHITE</w:t>
+            </w:r>
+          </w:p>
+        </w:tc>
+        <w:tc>
+          <w:tcPr>
+            <w:tcW w:type="dxa" w:w="1560"/>
+            <w:tcMar>
+              <w:top w:type="dxa" w:w="50"/>
+              <w:left w:type="dxa" w:w="90"/>
+              <w:bottom w:type="dxa" w:w="50"/>
+              <w:right w:type="dxa" w:w="90"/>
+            </w:tcMar>
+          </w:tcPr>
+          <w:p>
+            <w:pPr>
+              <w:spacing w:after="30" w:line="248"/>
+              <w:jc w:val="center"/>
+            </w:pPr>
+            <w:r>
+              <w:rPr>
+                <w:rFonts w:ascii="Times New Roman" w:cs="Times New Roman" w:eastAsia="Times New Roman" w:hAnsi="Times New Roman"/>
+                <w:b/>
+                <w:bCs/>
+                <w:color w:val="444444"/>
+                <w:sz w:val="20"/>
+                <w:szCs w:val="20"/>
+              </w:rPr>
+              <w:t xml:space="preserve">WHITE</w:t>
+            </w:r>
+          </w:p>
+        </w:tc>
+        <w:tc>
+          <w:tcPr>
+            <w:tcW w:type="dxa" w:w="2958"/>
+            <w:tcMar>
+              <w:top w:type="dxa" w:w="50"/>
+              <w:left w:type="dxa" w:w="90"/>
+              <w:bottom w:type="dxa" w:w="50"/>
+              <w:right w:type="dxa" w:w="90"/>
+            </w:tcMar>
+          </w:tcPr>
+          <w:p>
+            <w:pPr>
+              <w:spacing w:after="30" w:line="248"/>
+              <w:jc w:val="left"/>
+            </w:pPr>
+            <w:r>
+              <w:rPr>
+                <w:rFonts w:ascii="Times New Roman" w:cs="Times New Roman" w:eastAsia="Times New Roman" w:hAnsi="Times New Roman"/>
+                <w:b/>
+                <w:bCs/>
+                <w:color w:val="555555"/>
+                <w:sz w:val="20"/>
+                <w:szCs w:val="20"/>
+              </w:rPr>
+              <w:t xml:space="preserve">Fully aligned</w:t>
+            </w:r>
+          </w:p>
+        </w:tc>
+      </w:tr>
+      <w:tr>
+        <w:tc>
+          <w:tcPr>
+            <w:tcW w:type="dxa" w:w="2760"/>
+            <w:tcMar>
+              <w:top w:type="dxa" w:w="50"/>
+              <w:left w:type="dxa" w:w="90"/>
+              <w:bottom w:type="dxa" w:w="50"/>
+              <w:right w:type="dxa" w:w="90"/>
+            </w:tcMar>
+          </w:tcPr>
+          <w:p>
+            <w:pPr>
+              <w:spacing w:after="30" w:line="248"/>
+              <w:jc w:val="left"/>
+            </w:pPr>
+            <w:r>
+              <w:rPr>
+                <w:rFonts w:ascii="Times New Roman" w:cs="Times New Roman" w:eastAsia="Times New Roman" w:hAnsi="Times New Roman"/>
+                <w:b w:val="false"/>
+                <w:bCs w:val="false"/>
+                <w:color w:val="1A1A1A"/>
+                <w:sz w:val="20"/>
+                <w:szCs w:val="20"/>
+              </w:rPr>
+              <w:t xml:space="preserve">Coir-pith final product; coir rope; curled coir</w:t>
+            </w:r>
+          </w:p>
+        </w:tc>
+        <w:tc>
+          <w:tcPr>
+            <w:tcW w:type="dxa" w:w="1180"/>
+            <w:tcMar>
+              <w:top w:type="dxa" w:w="50"/>
+              <w:left w:type="dxa" w:w="90"/>
+              <w:bottom w:type="dxa" w:w="50"/>
+              <w:right w:type="dxa" w:w="90"/>
+            </w:tcMar>
+          </w:tcPr>
+          <w:p>
+            <w:pPr>
+              <w:spacing w:after="30" w:line="248"/>
+              <w:jc w:val="center"/>
+            </w:pPr>
+            <w:r>
+              <w:rPr>
+                <w:rFonts w:ascii="Times New Roman" w:cs="Times New Roman" w:eastAsia="Times New Roman" w:hAnsi="Times New Roman"/>
+                <w:b/>
+                <w:bCs/>
+                <w:color w:val="444444"/>
+                <w:sz w:val="20"/>
+                <w:szCs w:val="20"/>
+              </w:rPr>
+              <w:t xml:space="preserve">WHITE</w:t>
+            </w:r>
+          </w:p>
+        </w:tc>
+        <w:tc>
+          <w:tcPr>
+            <w:tcW w:type="dxa" w:w="1180"/>
+            <w:tcMar>
+              <w:top w:type="dxa" w:w="50"/>
+              <w:left w:type="dxa" w:w="90"/>
+              <w:bottom w:type="dxa" w:w="50"/>
+              <w:right w:type="dxa" w:w="90"/>
+            </w:tcMar>
+          </w:tcPr>
+          <w:p>
+            <w:pPr>
+              <w:spacing w:after="30" w:line="248"/>
+              <w:jc w:val="center"/>
+            </w:pPr>
+            <w:r>
+              <w:rPr>
+                <w:rFonts w:ascii="Times New Roman" w:cs="Times New Roman" w:eastAsia="Times New Roman" w:hAnsi="Times New Roman"/>
+                <w:b/>
+                <w:bCs/>
+                <w:color w:val="444444"/>
+                <w:sz w:val="20"/>
+                <w:szCs w:val="20"/>
+              </w:rPr>
+              <w:t xml:space="preserve">WHITE</w:t>
+            </w:r>
+          </w:p>
+        </w:tc>
+        <w:tc>
+          <w:tcPr>
+            <w:tcW w:type="dxa" w:w="1560"/>
+            <w:tcMar>
+              <w:top w:type="dxa" w:w="50"/>
+              <w:left w:type="dxa" w:w="90"/>
+              <w:bottom w:type="dxa" w:w="50"/>
+              <w:right w:type="dxa" w:w="90"/>
+            </w:tcMar>
+          </w:tcPr>
+          <w:p>
+            <w:pPr>
+              <w:spacing w:after="30" w:line="248"/>
+              <w:jc w:val="center"/>
+            </w:pPr>
+            <w:r>
+              <w:rPr>
+                <w:rFonts w:ascii="Times New Roman" w:cs="Times New Roman" w:eastAsia="Times New Roman" w:hAnsi="Times New Roman"/>
+                <w:b/>
+                <w:bCs/>
+                <w:color w:val="444444"/>
+                <w:sz w:val="20"/>
+                <w:szCs w:val="20"/>
+              </w:rPr>
+              <w:t xml:space="preserve">WHITE</w:t>
+            </w:r>
+          </w:p>
+        </w:tc>
+        <w:tc>
+          <w:tcPr>
+            <w:tcW w:type="dxa" w:w="2958"/>
+            <w:tcMar>
+              <w:top w:type="dxa" w:w="50"/>
+              <w:left w:type="dxa" w:w="90"/>
+              <w:bottom w:type="dxa" w:w="50"/>
+              <w:right w:type="dxa" w:w="90"/>
+            </w:tcMar>
+          </w:tcPr>
+          <w:p>
+            <w:pPr>
+              <w:spacing w:after="30" w:line="248"/>
+              <w:jc w:val="left"/>
+            </w:pPr>
+            <w:r>
+              <w:rPr>
+                <w:rFonts w:ascii="Times New Roman" w:cs="Times New Roman" w:eastAsia="Times New Roman" w:hAnsi="Times New Roman"/>
+                <w:b/>
+                <w:bCs/>
+                <w:color w:val="555555"/>
+                <w:sz w:val="20"/>
+                <w:szCs w:val="20"/>
+              </w:rPr>
+              <w:t xml:space="preserve">Fully aligned</w:t>
             </w:r>
           </w:p>
         </w:tc>
@@ -969,16 +1566,18 @@
     </w:tbl>
     <w:p>
       <w:pPr>
-        <w:spacing w:after="120"/>
-      </w:pPr>
-      <w:r>
-        <w:rPr>
-          <w:rFonts w:ascii="Times New Roman" w:cs="Times New Roman" w:eastAsia="Times New Roman" w:hAnsi="Times New Roman"/>
-          <w:color w:val="1A1A1A"/>
-          <w:sz w:val="22"/>
-          <w:szCs w:val="22"/>
-        </w:rPr>
-        <w:t xml:space="preserve"/>
+        <w:spacing w:after="120" w:before="60" w:line="252"/>
+      </w:pPr>
+      <w:r>
+        <w:rPr>
+          <w:rFonts w:ascii="Times New Roman" w:cs="Times New Roman" w:eastAsia="Times New Roman" w:hAnsi="Times New Roman"/>
+          <w:i/>
+          <w:iCs/>
+          <w:color w:val="555555"/>
+          <w:sz w:val="18"/>
+          <w:szCs w:val="18"/>
+        </w:rPr>
+        <w:t xml:space="preserve">† CPCB's 2016 categorisation list places “Manufacturing of coir items from coconut husks” in the White category; its 2023 draft re-categorisation places dry coir processing in Green, coir items in White, and only wet / dyeing coir in Orange. CPCB does not list ordinary husk retting or dry de-fibring as a Red sector.</w:t>
       </w:r>
     </w:p>
     <w:p>
@@ -992,127 +1591,67 @@
           <w:sz w:val="22"/>
           <w:szCs w:val="22"/>
         </w:rPr>
-        <w:t xml:space="preserve">Two points follow. </w:t>
-      </w:r>
-      <w:r>
-        <w:rPr>
-          <w:rFonts w:ascii="Times New Roman" w:cs="Times New Roman" w:eastAsia="Times New Roman" w:hAnsi="Times New Roman"/>
-          <w:b/>
-          <w:bCs/>
-          <w:color w:val="1A1A1A"/>
-          <w:sz w:val="22"/>
-          <w:szCs w:val="22"/>
-        </w:rPr>
-        <w:t xml:space="preserve">First</w:t>
-      </w:r>
-      <w:r>
-        <w:rPr>
-          <w:rFonts w:ascii="Times New Roman" w:cs="Times New Roman" w:eastAsia="Times New Roman" w:hAnsi="Times New Roman"/>
-          <w:color w:val="1A1A1A"/>
-          <w:sz w:val="22"/>
-          <w:szCs w:val="22"/>
-        </w:rPr>
-        <w:t xml:space="preserve">, Kerala </w:t>
-      </w:r>
-      <w:r>
-        <w:rPr>
-          <w:rFonts w:ascii="Times New Roman" w:cs="Times New Roman" w:eastAsia="Times New Roman" w:hAnsi="Times New Roman"/>
-          <w:b/>
-          <w:bCs/>
-          <w:color w:val="1A1A1A"/>
-          <w:sz w:val="22"/>
-          <w:szCs w:val="22"/>
-        </w:rPr>
-        <w:t xml:space="preserve">already</w:t>
-      </w:r>
-      <w:r>
-        <w:rPr>
-          <w:rFonts w:ascii="Times New Roman" w:cs="Times New Roman" w:eastAsia="Times New Roman" w:hAnsi="Times New Roman"/>
-          <w:color w:val="1A1A1A"/>
-          <w:sz w:val="22"/>
-          <w:szCs w:val="22"/>
-        </w:rPr>
-        <w:t xml:space="preserve"> treats dry coir manufacturing — coir products, yarn without dyeing, coir pith as a final product, rope and curled coir — as </w:t>
-      </w:r>
-      <w:r>
-        <w:rPr>
-          <w:rFonts w:ascii="Times New Roman" w:cs="Times New Roman" w:eastAsia="Times New Roman" w:hAnsi="Times New Roman"/>
-          <w:b/>
-          <w:bCs/>
-          <w:color w:val="1A1A1A"/>
-          <w:sz w:val="22"/>
-          <w:szCs w:val="22"/>
-        </w:rPr>
-        <w:t xml:space="preserve">White</w:t>
-      </w:r>
-      <w:r>
-        <w:rPr>
-          <w:rFonts w:ascii="Times New Roman" w:cs="Times New Roman" w:eastAsia="Times New Roman" w:hAnsi="Times New Roman"/>
-          <w:color w:val="1A1A1A"/>
-          <w:sz w:val="22"/>
-          <w:szCs w:val="22"/>
-        </w:rPr>
-        <w:t xml:space="preserve">, matching the national CPCB White-category treatment. There is therefore </w:t>
-      </w:r>
-      <w:r>
-        <w:rPr>
-          <w:rFonts w:ascii="Times New Roman" w:cs="Times New Roman" w:eastAsia="Times New Roman" w:hAnsi="Times New Roman"/>
-          <w:b/>
-          <w:bCs/>
-          <w:color w:val="1A1A1A"/>
-          <w:sz w:val="22"/>
-          <w:szCs w:val="22"/>
-        </w:rPr>
-        <w:t xml:space="preserve">no dispute</w:t>
-      </w:r>
-      <w:r>
-        <w:rPr>
-          <w:rFonts w:ascii="Times New Roman" w:cs="Times New Roman" w:eastAsia="Times New Roman" w:hAnsi="Times New Roman"/>
-          <w:color w:val="1A1A1A"/>
-          <w:sz w:val="22"/>
-          <w:szCs w:val="22"/>
-        </w:rPr>
-        <w:t xml:space="preserve"> about dry value-addition. </w:t>
-      </w:r>
-      <w:r>
-        <w:rPr>
-          <w:rFonts w:ascii="Times New Roman" w:cs="Times New Roman" w:eastAsia="Times New Roman" w:hAnsi="Times New Roman"/>
-          <w:b/>
-          <w:bCs/>
-          <w:color w:val="1A1A1A"/>
-          <w:sz w:val="22"/>
-          <w:szCs w:val="22"/>
-        </w:rPr>
-        <w:t xml:space="preserve">Second</w:t>
-      </w:r>
-      <w:r>
-        <w:rPr>
-          <w:rFonts w:ascii="Times New Roman" w:cs="Times New Roman" w:eastAsia="Times New Roman" w:hAnsi="Times New Roman"/>
-          <w:color w:val="1A1A1A"/>
-          <w:sz w:val="22"/>
-          <w:szCs w:val="22"/>
-        </w:rPr>
-        <w:t xml:space="preserve">, the real and only bottleneck is at the </w:t>
-      </w:r>
-      <w:r>
-        <w:rPr>
-          <w:rFonts w:ascii="Times New Roman" w:cs="Times New Roman" w:eastAsia="Times New Roman" w:hAnsi="Times New Roman"/>
-          <w:b/>
-          <w:bCs/>
-          <w:color w:val="1A1A1A"/>
-          <w:sz w:val="22"/>
-          <w:szCs w:val="22"/>
-        </w:rPr>
-        <w:t xml:space="preserve">primary end</w:t>
-      </w:r>
-      <w:r>
-        <w:rPr>
-          <w:rFonts w:ascii="Times New Roman" w:cs="Times New Roman" w:eastAsia="Times New Roman" w:hAnsi="Times New Roman"/>
-          <w:color w:val="1A1A1A"/>
-          <w:sz w:val="22"/>
-          <w:szCs w:val="22"/>
-        </w:rPr>
-        <w:t xml:space="preserve"> of the chain: retting (Red) and de-fibring / ginning (Orange). Both require full Consent to Establish and Consent to Operate, and retting specifically can trigger public-hearing-tier scrutiny — which, for small MSME/cottage units, is prohibitive.</w:t>
+        <w:t xml:space="preserve">Read down the last column: on </w:t>
+      </w:r>
+      <w:r>
+        <w:rPr>
+          <w:rFonts w:ascii="Times New Roman" w:cs="Times New Roman" w:eastAsia="Times New Roman" w:hAnsi="Times New Roman"/>
+          <w:b/>
+          <w:bCs/>
+          <w:color w:val="1A1A1A"/>
+          <w:sz w:val="22"/>
+          <w:szCs w:val="22"/>
+        </w:rPr>
+        <w:t xml:space="preserve">five of seven</w:t>
+      </w:r>
+      <w:r>
+        <w:rPr>
+          <w:rFonts w:ascii="Times New Roman" w:cs="Times New Roman" w:eastAsia="Times New Roman" w:hAnsi="Times New Roman"/>
+          <w:color w:val="1A1A1A"/>
+          <w:sz w:val="22"/>
+          <w:szCs w:val="22"/>
+        </w:rPr>
+        <w:t xml:space="preserve"> activities the three regulators broadly agree. The entire dispute is the </w:t>
+      </w:r>
+      <w:r>
+        <w:rPr>
+          <w:rFonts w:ascii="Times New Roman" w:cs="Times New Roman" w:eastAsia="Times New Roman" w:hAnsi="Times New Roman"/>
+          <w:b/>
+          <w:bCs/>
+          <w:color w:val="1A1A1A"/>
+          <w:sz w:val="22"/>
+          <w:szCs w:val="22"/>
+        </w:rPr>
+        <w:t xml:space="preserve">top two rows</w:t>
+      </w:r>
+      <w:r>
+        <w:rPr>
+          <w:rFonts w:ascii="Times New Roman" w:cs="Times New Roman" w:eastAsia="Times New Roman" w:hAnsi="Times New Roman"/>
+          <w:color w:val="1A1A1A"/>
+          <w:sz w:val="22"/>
+          <w:szCs w:val="22"/>
+        </w:rPr>
+        <w:t xml:space="preserve"> — retting and de-fibring / ginning — where </w:t>
+      </w:r>
+      <w:r>
+        <w:rPr>
+          <w:rFonts w:ascii="Times New Roman" w:cs="Times New Roman" w:eastAsia="Times New Roman" w:hAnsi="Times New Roman"/>
+          <w:b/>
+          <w:bCs/>
+          <w:color w:val="1A1A1A"/>
+          <w:sz w:val="22"/>
+          <w:szCs w:val="22"/>
+        </w:rPr>
+        <w:t xml:space="preserve">Kerala stands alone</w:t>
+      </w:r>
+      <w:r>
+        <w:rPr>
+          <w:rFonts w:ascii="Times New Roman" w:cs="Times New Roman" w:eastAsia="Times New Roman" w:hAnsi="Times New Roman"/>
+          <w:color w:val="1A1A1A"/>
+          <w:sz w:val="22"/>
+          <w:szCs w:val="22"/>
+        </w:rPr>
+        <w:t xml:space="preserve"> in imposing Red / Orange treatment on activities that Tamil Nadu and the Central norm regard as White.</w:t>
       </w:r>
     </w:p>
     <w:p>
@@ -1129,7 +1668,7 @@
           <w:sz w:val="24"/>
           <w:szCs w:val="24"/>
         </w:rPr>
-        <w:t xml:space="preserve">3.  The comparator: Tamil Nadu treats the identical husk and process as White</w:t>
+        <w:t xml:space="preserve">3.  Why this made Pollachi the hub and left Chittur out</w:t>
       </w:r>
     </w:p>
     <w:p>
@@ -1143,27 +1682,7 @@
           <w:sz w:val="22"/>
           <w:szCs w:val="22"/>
         </w:rPr>
-        <w:t xml:space="preserve">The Tamil Nadu Pollution Control Board (TNPCB) classifies the entire </w:t>
-      </w:r>
-      <w:r>
-        <w:rPr>
-          <w:rFonts w:ascii="Times New Roman" w:cs="Times New Roman" w:eastAsia="Times New Roman" w:hAnsi="Times New Roman"/>
-          <w:b/>
-          <w:bCs/>
-          <w:color w:val="1A1A1A"/>
-          <w:sz w:val="22"/>
-          <w:szCs w:val="22"/>
-        </w:rPr>
-        <w:t xml:space="preserve">“coconut-husk retting / de-fibering / pith-processing industry”</w:t>
-      </w:r>
-      <w:r>
-        <w:rPr>
-          <w:rFonts w:ascii="Times New Roman" w:cs="Times New Roman" w:eastAsia="Times New Roman" w:hAnsi="Times New Roman"/>
-          <w:color w:val="1A1A1A"/>
-          <w:sz w:val="22"/>
-          <w:szCs w:val="22"/>
-        </w:rPr>
-        <w:t xml:space="preserve"> in the </w:t>
+        <w:t xml:space="preserve">Category is not a label — it decides whether a small unit can exist. A </w:t>
       </w:r>
       <w:r>
         <w:rPr>
@@ -1183,27 +1702,121 @@
           <w:sz w:val="22"/>
           <w:szCs w:val="22"/>
         </w:rPr>
-        <w:t xml:space="preserve"> category. The recent history is directly on point (reproduced at </w:t>
-      </w:r>
-      <w:r>
-        <w:rPr>
-          <w:rFonts w:ascii="Times New Roman" w:cs="Times New Roman" w:eastAsia="Times New Roman" w:hAnsi="Times New Roman"/>
-          <w:b/>
-          <w:bCs/>
-          <w:color w:val="1A1A1A"/>
-          <w:sz w:val="22"/>
-          <w:szCs w:val="22"/>
-        </w:rPr>
-        <w:t xml:space="preserve">Annexure B</w:t>
-      </w:r>
-      <w:r>
-        <w:rPr>
-          <w:rFonts w:ascii="Times New Roman" w:cs="Times New Roman" w:eastAsia="Times New Roman" w:hAnsi="Times New Roman"/>
-          <w:color w:val="1A1A1A"/>
-          <w:sz w:val="22"/>
-          <w:szCs w:val="22"/>
-        </w:rPr>
-        <w:t xml:space="preserve">):</w:t>
+        <w:t xml:space="preserve"> activity needs </w:t>
+      </w:r>
+      <w:r>
+        <w:rPr>
+          <w:rFonts w:ascii="Times New Roman" w:cs="Times New Roman" w:eastAsia="Times New Roman" w:hAnsi="Times New Roman"/>
+          <w:b/>
+          <w:bCs/>
+          <w:color w:val="1A1A1A"/>
+          <w:sz w:val="22"/>
+          <w:szCs w:val="22"/>
+        </w:rPr>
+        <w:t xml:space="preserve">no Consent to Operate</w:t>
+      </w:r>
+      <w:r>
+        <w:rPr>
+          <w:rFonts w:ascii="Times New Roman" w:cs="Times New Roman" w:eastAsia="Times New Roman" w:hAnsi="Times New Roman"/>
+          <w:color w:val="1A1A1A"/>
+          <w:sz w:val="22"/>
+          <w:szCs w:val="22"/>
+        </w:rPr>
+        <w:t xml:space="preserve">; a simple intimation suffices, and the unit can start almost at once. A </w:t>
+      </w:r>
+      <w:r>
+        <w:rPr>
+          <w:rFonts w:ascii="Times New Roman" w:cs="Times New Roman" w:eastAsia="Times New Roman" w:hAnsi="Times New Roman"/>
+          <w:b/>
+          <w:bCs/>
+          <w:color w:val="1A1A1A"/>
+          <w:sz w:val="22"/>
+          <w:szCs w:val="22"/>
+        </w:rPr>
+        <w:t xml:space="preserve">Red</w:t>
+      </w:r>
+      <w:r>
+        <w:rPr>
+          <w:rFonts w:ascii="Times New Roman" w:cs="Times New Roman" w:eastAsia="Times New Roman" w:hAnsi="Times New Roman"/>
+          <w:color w:val="1A1A1A"/>
+          <w:sz w:val="22"/>
+          <w:szCs w:val="22"/>
+        </w:rPr>
+        <w:t xml:space="preserve"> activity needs a full Consent to Establish and Consent to Operate and can attract </w:t>
+      </w:r>
+      <w:r>
+        <w:rPr>
+          <w:rFonts w:ascii="Times New Roman" w:cs="Times New Roman" w:eastAsia="Times New Roman" w:hAnsi="Times New Roman"/>
+          <w:b/>
+          <w:bCs/>
+          <w:color w:val="1A1A1A"/>
+          <w:sz w:val="22"/>
+          <w:szCs w:val="22"/>
+        </w:rPr>
+        <w:t xml:space="preserve">public-hearing-tier scrutiny</w:t>
+      </w:r>
+      <w:r>
+        <w:rPr>
+          <w:rFonts w:ascii="Times New Roman" w:cs="Times New Roman" w:eastAsia="Times New Roman" w:hAnsi="Times New Roman"/>
+          <w:color w:val="1A1A1A"/>
+          <w:sz w:val="22"/>
+          <w:szCs w:val="22"/>
+        </w:rPr>
+        <w:t xml:space="preserve">; an </w:t>
+      </w:r>
+      <w:r>
+        <w:rPr>
+          <w:rFonts w:ascii="Times New Roman" w:cs="Times New Roman" w:eastAsia="Times New Roman" w:hAnsi="Times New Roman"/>
+          <w:b/>
+          <w:bCs/>
+          <w:color w:val="1A1A1A"/>
+          <w:sz w:val="22"/>
+          <w:szCs w:val="22"/>
+        </w:rPr>
+        <w:t xml:space="preserve">Orange</w:t>
+      </w:r>
+      <w:r>
+        <w:rPr>
+          <w:rFonts w:ascii="Times New Roman" w:cs="Times New Roman" w:eastAsia="Times New Roman" w:hAnsi="Times New Roman"/>
+          <w:color w:val="1A1A1A"/>
+          <w:sz w:val="22"/>
+          <w:szCs w:val="22"/>
+        </w:rPr>
+        <w:t xml:space="preserve"> activity needs the same consents plus periodic monitoring. For a cottage / MSME coir unit, that is the difference between opening and not opening.</w:t>
+      </w:r>
+    </w:p>
+    <w:p>
+      <w:pPr>
+        <w:spacing w:after="120" w:line="276"/>
+      </w:pPr>
+      <w:r>
+        <w:rPr>
+          <w:rFonts w:ascii="Times New Roman" w:cs="Times New Roman" w:eastAsia="Times New Roman" w:hAnsi="Times New Roman"/>
+          <w:color w:val="1A1A1A"/>
+          <w:sz w:val="22"/>
+          <w:szCs w:val="22"/>
+        </w:rPr>
+        <w:t xml:space="preserve">So a coir entrepreneur — including many from Kerala — does the obvious thing: he sets up retting and de-fibring </w:t>
+      </w:r>
+      <w:r>
+        <w:rPr>
+          <w:rFonts w:ascii="Times New Roman" w:cs="Times New Roman" w:eastAsia="Times New Roman" w:hAnsi="Times New Roman"/>
+          <w:b/>
+          <w:bCs/>
+          <w:color w:val="1A1A1A"/>
+          <w:sz w:val="22"/>
+          <w:szCs w:val="22"/>
+        </w:rPr>
+        <w:t xml:space="preserve">80 km away in Pollachi</w:t>
+      </w:r>
+      <w:r>
+        <w:rPr>
+          <w:rFonts w:ascii="Times New Roman" w:cs="Times New Roman" w:eastAsia="Times New Roman" w:hAnsi="Times New Roman"/>
+          <w:color w:val="1A1A1A"/>
+          <w:sz w:val="22"/>
+          <w:szCs w:val="22"/>
+        </w:rPr>
+        <w:t xml:space="preserve">, where they are White, and leaves Chittur out. The result on the ground:</w:t>
       </w:r>
     </w:p>
     <w:p>
@@ -1224,16 +1837,16 @@
           <w:sz w:val="22"/>
           <w:szCs w:val="22"/>
         </w:rPr>
-        <w:t xml:space="preserve">10-11-2021 — </w:t>
-      </w:r>
-      <w:r>
-        <w:rPr>
-          <w:rFonts w:ascii="Times New Roman" w:cs="Times New Roman" w:eastAsia="Times New Roman" w:hAnsi="Times New Roman"/>
-          <w:color w:val="1A1A1A"/>
-          <w:sz w:val="22"/>
-          <w:szCs w:val="22"/>
-        </w:rPr>
-        <w:t xml:space="preserve">By proceedings dated 10 November 2021, TNPCB reclassified the coir industry from White to Orange, purportedly on directions of the environmental tribunal and courts, thereby subjecting these units to consent and periodic monitoring.</w:t>
+        <w:t xml:space="preserve">The husk moves, not the value. </w:t>
+      </w:r>
+      <w:r>
+        <w:rPr>
+          <w:rFonts w:ascii="Times New Roman" w:cs="Times New Roman" w:eastAsia="Times New Roman" w:hAnsi="Times New Roman"/>
+          <w:color w:val="1A1A1A"/>
+          <w:sz w:val="22"/>
+          <w:szCs w:val="22"/>
+        </w:rPr>
+        <w:t xml:space="preserve">Our coconut husk is carted to Pollachi, processed there, and the fibre, pith, jobs and margins are booked in Tamil Nadu.</w:t>
       </w:r>
     </w:p>
     <w:p>
@@ -1254,486 +1867,46 @@
           <w:sz w:val="22"/>
           <w:szCs w:val="22"/>
         </w:rPr>
-        <w:t xml:space="preserve">12-10-2023 — </w:t>
-      </w:r>
-      <w:r>
-        <w:rPr>
-          <w:rFonts w:ascii="Times New Roman" w:cs="Times New Roman" w:eastAsia="Times New Roman" w:hAnsi="Times New Roman"/>
-          <w:color w:val="1A1A1A"/>
-          <w:sz w:val="22"/>
-          <w:szCs w:val="22"/>
-        </w:rPr>
-        <w:t xml:space="preserve">After an enormous number of representations from coir exporters' and manufacturers' associations, TNPCB formally </w:t>
-      </w:r>
-      <w:r>
-        <w:rPr>
-          <w:rFonts w:ascii="Times New Roman" w:cs="Times New Roman" w:eastAsia="Times New Roman" w:hAnsi="Times New Roman"/>
-          <w:b/>
-          <w:bCs/>
-          <w:color w:val="1A1A1A"/>
-          <w:sz w:val="22"/>
-          <w:szCs w:val="22"/>
-        </w:rPr>
-        <w:t xml:space="preserve">withdrew</w:t>
-      </w:r>
-      <w:r>
-        <w:rPr>
-          <w:rFonts w:ascii="Times New Roman" w:cs="Times New Roman" w:eastAsia="Times New Roman" w:hAnsi="Times New Roman"/>
-          <w:color w:val="1A1A1A"/>
-          <w:sz w:val="22"/>
-          <w:szCs w:val="22"/>
-        </w:rPr>
-        <w:t xml:space="preserve"> that Orange reclassification, expressly </w:t>
-      </w:r>
-      <w:r>
-        <w:rPr>
-          <w:rFonts w:ascii="Times New Roman" w:cs="Times New Roman" w:eastAsia="Times New Roman" w:hAnsi="Times New Roman"/>
-          <w:i/>
-          <w:iCs/>
-          <w:color w:val="1A1A1A"/>
-          <w:sz w:val="22"/>
-          <w:szCs w:val="22"/>
-        </w:rPr>
-        <w:t xml:space="preserve">“considering the coir industry is one of the vital agro-based cottage-type industries in the State contributing significantly to the creation of livelihood in major coconut-growing districts and to encourage the cottage-type MSME sector for the production of eco-friendly products”</w:t>
-      </w:r>
-      <w:r>
-        <w:rPr>
-          <w:rFonts w:ascii="Times New Roman" w:cs="Times New Roman" w:eastAsia="Times New Roman" w:hAnsi="Times New Roman"/>
-          <w:color w:val="1A1A1A"/>
-          <w:sz w:val="22"/>
-          <w:szCs w:val="22"/>
-        </w:rPr>
-        <w:t xml:space="preserve">, restoring the coconut-husk retting / de-fibring / pith-processing industry to the </w:t>
-      </w:r>
-      <w:r>
-        <w:rPr>
-          <w:rFonts w:ascii="Times New Roman" w:cs="Times New Roman" w:eastAsia="Times New Roman" w:hAnsi="Times New Roman"/>
-          <w:b/>
-          <w:bCs/>
-          <w:color w:val="1A1A1A"/>
-          <w:sz w:val="22"/>
-          <w:szCs w:val="22"/>
-        </w:rPr>
-        <w:t xml:space="preserve">White</w:t>
-      </w:r>
-      <w:r>
-        <w:rPr>
-          <w:rFonts w:ascii="Times New Roman" w:cs="Times New Roman" w:eastAsia="Times New Roman" w:hAnsi="Times New Roman"/>
-          <w:color w:val="1A1A1A"/>
-          <w:sz w:val="22"/>
-          <w:szCs w:val="22"/>
-        </w:rPr>
-        <w:t xml:space="preserve"> category.</w:t>
-      </w:r>
-    </w:p>
-    <w:p>
-      <w:pPr>
-        <w:spacing w:after="120" w:line="276"/>
-      </w:pPr>
-      <w:r>
-        <w:rPr>
-          <w:rFonts w:ascii="Times New Roman" w:cs="Times New Roman" w:eastAsia="Times New Roman" w:hAnsi="Times New Roman"/>
-          <w:color w:val="1A1A1A"/>
-          <w:sz w:val="22"/>
-          <w:szCs w:val="22"/>
-        </w:rPr>
-        <w:t xml:space="preserve">The comparison could not be starker. It is the </w:t>
-      </w:r>
-      <w:r>
-        <w:rPr>
-          <w:rFonts w:ascii="Times New Roman" w:cs="Times New Roman" w:eastAsia="Times New Roman" w:hAnsi="Times New Roman"/>
-          <w:b/>
-          <w:bCs/>
-          <w:color w:val="1A1A1A"/>
-          <w:sz w:val="22"/>
-          <w:szCs w:val="22"/>
-        </w:rPr>
-        <w:t xml:space="preserve">same husk, the same process chain, roughly 80 km apart across the same district border</w:t>
-      </w:r>
-      <w:r>
-        <w:rPr>
-          <w:rFonts w:ascii="Times New Roman" w:cs="Times New Roman" w:eastAsia="Times New Roman" w:hAnsi="Times New Roman"/>
-          <w:color w:val="1A1A1A"/>
-          <w:sz w:val="22"/>
-          <w:szCs w:val="22"/>
-        </w:rPr>
-        <w:t xml:space="preserve"> — yet placed in opposite regulatory tiers:</w:t>
-      </w:r>
-    </w:p>
-    <w:tbl>
-      <w:tblPr>
-        <w:tblW w:type="dxa" w:w="9638"/>
-        <w:tblBorders>
-          <w:top w:val="single" w:color="808080" w:sz="4"/>
-          <w:left w:val="single" w:color="808080" w:sz="4"/>
-          <w:bottom w:val="single" w:color="808080" w:sz="4"/>
-          <w:right w:val="single" w:color="808080" w:sz="4"/>
-          <w:insideH w:val="single" w:color="808080" w:sz="4"/>
-          <w:insideV w:val="single" w:color="808080" w:sz="4"/>
-        </w:tblBorders>
-      </w:tblPr>
-      <w:tblGrid>
-        <w:gridCol w:w="3238"/>
-        <w:gridCol w:w="3200"/>
-        <w:gridCol w:w="3200"/>
-      </w:tblGrid>
-      <w:tr>
-        <w:trPr>
-          <w:tblHeader/>
-        </w:trPr>
-        <w:tc>
-          <w:tcPr>
-            <w:tcW w:type="dxa" w:w="3238"/>
-            <w:shd w:fill="E9EFE9" w:color="auto" w:val="clear"/>
-            <w:tcMar>
-              <w:top w:type="dxa" w:w="60"/>
-              <w:left w:type="dxa" w:w="100"/>
-              <w:bottom w:type="dxa" w:w="60"/>
-              <w:right w:type="dxa" w:w="100"/>
-            </w:tcMar>
-          </w:tcPr>
-          <w:p>
-            <w:pPr>
-              <w:spacing w:after="40" w:line="252"/>
-              <w:jc w:val="left"/>
-            </w:pPr>
-            <w:r>
-              <w:rPr>
-                <w:rFonts w:ascii="Times New Roman" w:cs="Times New Roman" w:eastAsia="Times New Roman" w:hAnsi="Times New Roman"/>
-                <w:b/>
-                <w:bCs/>
-                <w:color w:val="222222"/>
-                <w:sz w:val="20"/>
-                <w:szCs w:val="20"/>
-              </w:rPr>
-              <w:t xml:space="preserve">Process</w:t>
-            </w:r>
-          </w:p>
-        </w:tc>
-        <w:tc>
-          <w:tcPr>
-            <w:tcW w:type="dxa" w:w="3200"/>
-            <w:shd w:fill="E9EFE9" w:color="auto" w:val="clear"/>
-            <w:tcMar>
-              <w:top w:type="dxa" w:w="60"/>
-              <w:left w:type="dxa" w:w="100"/>
-              <w:bottom w:type="dxa" w:w="60"/>
-              <w:right w:type="dxa" w:w="100"/>
-            </w:tcMar>
-          </w:tcPr>
-          <w:p>
-            <w:pPr>
-              <w:spacing w:after="40" w:line="252"/>
-              <w:jc w:val="center"/>
-            </w:pPr>
-            <w:r>
-              <w:rPr>
-                <w:rFonts w:ascii="Times New Roman" w:cs="Times New Roman" w:eastAsia="Times New Roman" w:hAnsi="Times New Roman"/>
-                <w:b/>
-                <w:bCs/>
-                <w:color w:val="222222"/>
-                <w:sz w:val="20"/>
-                <w:szCs w:val="20"/>
-              </w:rPr>
-              <w:t xml:space="preserve">Kerala (KSPCB)</w:t>
-            </w:r>
-          </w:p>
-        </w:tc>
-        <w:tc>
-          <w:tcPr>
-            <w:tcW w:type="dxa" w:w="3200"/>
-            <w:shd w:fill="E9EFE9" w:color="auto" w:val="clear"/>
-            <w:tcMar>
-              <w:top w:type="dxa" w:w="60"/>
-              <w:left w:type="dxa" w:w="100"/>
-              <w:bottom w:type="dxa" w:w="60"/>
-              <w:right w:type="dxa" w:w="100"/>
-            </w:tcMar>
-          </w:tcPr>
-          <w:p>
-            <w:pPr>
-              <w:spacing w:after="40" w:line="252"/>
-              <w:jc w:val="center"/>
-            </w:pPr>
-            <w:r>
-              <w:rPr>
-                <w:rFonts w:ascii="Times New Roman" w:cs="Times New Roman" w:eastAsia="Times New Roman" w:hAnsi="Times New Roman"/>
-                <w:b/>
-                <w:bCs/>
-                <w:color w:val="222222"/>
-                <w:sz w:val="20"/>
-                <w:szCs w:val="20"/>
-              </w:rPr>
-              <w:t xml:space="preserve">Tamil Nadu (TNPCB)</w:t>
-            </w:r>
-          </w:p>
-        </w:tc>
-      </w:tr>
-      <w:tr>
-        <w:tc>
-          <w:tcPr>
-            <w:tcW w:type="dxa" w:w="3238"/>
-            <w:tcMar>
-              <w:top w:type="dxa" w:w="60"/>
-              <w:left w:type="dxa" w:w="100"/>
-              <w:bottom w:type="dxa" w:w="60"/>
-              <w:right w:type="dxa" w:w="100"/>
-            </w:tcMar>
-          </w:tcPr>
-          <w:p>
-            <w:pPr>
-              <w:spacing w:after="40" w:line="252"/>
-              <w:jc w:val="left"/>
-            </w:pPr>
-            <w:r>
-              <w:rPr>
-                <w:rFonts w:ascii="Times New Roman" w:cs="Times New Roman" w:eastAsia="Times New Roman" w:hAnsi="Times New Roman"/>
-                <w:b w:val="false"/>
-                <w:bCs w:val="false"/>
-                <w:color w:val="1A1A1A"/>
-                <w:sz w:val="20"/>
-                <w:szCs w:val="20"/>
-              </w:rPr>
-              <w:t xml:space="preserve">Coconut-husk retting</w:t>
-            </w:r>
-          </w:p>
-        </w:tc>
-        <w:tc>
-          <w:tcPr>
-            <w:tcW w:type="dxa" w:w="3200"/>
-            <w:tcMar>
-              <w:top w:type="dxa" w:w="60"/>
-              <w:left w:type="dxa" w:w="100"/>
-              <w:bottom w:type="dxa" w:w="60"/>
-              <w:right w:type="dxa" w:w="100"/>
-            </w:tcMar>
-          </w:tcPr>
-          <w:p>
-            <w:pPr>
-              <w:spacing w:after="40" w:line="252"/>
-            </w:pPr>
-            <w:r>
-              <w:rPr>
-                <w:rFonts w:ascii="Times New Roman" w:cs="Times New Roman" w:eastAsia="Times New Roman" w:hAnsi="Times New Roman"/>
-                <w:b/>
-                <w:bCs/>
-                <w:color w:val="C0392B"/>
-                <w:sz w:val="20"/>
-                <w:szCs w:val="20"/>
-              </w:rPr>
-              <w:t xml:space="preserve">RED</w:t>
-            </w:r>
-          </w:p>
-        </w:tc>
-        <w:tc>
-          <w:tcPr>
-            <w:tcW w:type="dxa" w:w="3200"/>
-            <w:tcMar>
-              <w:top w:type="dxa" w:w="60"/>
-              <w:left w:type="dxa" w:w="100"/>
-              <w:bottom w:type="dxa" w:w="60"/>
-              <w:right w:type="dxa" w:w="100"/>
-            </w:tcMar>
-          </w:tcPr>
-          <w:p>
-            <w:pPr>
-              <w:spacing w:after="40" w:line="252"/>
-            </w:pPr>
-            <w:r>
-              <w:rPr>
-                <w:rFonts w:ascii="Times New Roman" w:cs="Times New Roman" w:eastAsia="Times New Roman" w:hAnsi="Times New Roman"/>
-                <w:b/>
-                <w:bCs/>
-                <w:color w:val="444444"/>
-                <w:sz w:val="20"/>
-                <w:szCs w:val="20"/>
-              </w:rPr>
-              <w:t xml:space="preserve">WHITE</w:t>
-            </w:r>
-          </w:p>
-        </w:tc>
-      </w:tr>
-      <w:tr>
-        <w:tc>
-          <w:tcPr>
-            <w:tcW w:type="dxa" w:w="3238"/>
-            <w:tcMar>
-              <w:top w:type="dxa" w:w="60"/>
-              <w:left w:type="dxa" w:w="100"/>
-              <w:bottom w:type="dxa" w:w="60"/>
-              <w:right w:type="dxa" w:w="100"/>
-            </w:tcMar>
-          </w:tcPr>
-          <w:p>
-            <w:pPr>
-              <w:spacing w:after="40" w:line="252"/>
-              <w:jc w:val="left"/>
-            </w:pPr>
-            <w:r>
-              <w:rPr>
-                <w:rFonts w:ascii="Times New Roman" w:cs="Times New Roman" w:eastAsia="Times New Roman" w:hAnsi="Times New Roman"/>
-                <w:b w:val="false"/>
-                <w:bCs w:val="false"/>
-                <w:color w:val="1A1A1A"/>
-                <w:sz w:val="20"/>
-                <w:szCs w:val="20"/>
-              </w:rPr>
-              <w:t xml:space="preserve">Coir de-fibring / ginning</w:t>
-            </w:r>
-          </w:p>
-        </w:tc>
-        <w:tc>
-          <w:tcPr>
-            <w:tcW w:type="dxa" w:w="3200"/>
-            <w:tcMar>
-              <w:top w:type="dxa" w:w="60"/>
-              <w:left w:type="dxa" w:w="100"/>
-              <w:bottom w:type="dxa" w:w="60"/>
-              <w:right w:type="dxa" w:w="100"/>
-            </w:tcMar>
-          </w:tcPr>
-          <w:p>
-            <w:pPr>
-              <w:spacing w:after="40" w:line="252"/>
-            </w:pPr>
-            <w:r>
-              <w:rPr>
-                <w:rFonts w:ascii="Times New Roman" w:cs="Times New Roman" w:eastAsia="Times New Roman" w:hAnsi="Times New Roman"/>
-                <w:b/>
-                <w:bCs/>
-                <w:color w:val="C87A00"/>
-                <w:sz w:val="20"/>
-                <w:szCs w:val="20"/>
-              </w:rPr>
-              <w:t xml:space="preserve">ORANGE</w:t>
-            </w:r>
-          </w:p>
-        </w:tc>
-        <w:tc>
-          <w:tcPr>
-            <w:tcW w:type="dxa" w:w="3200"/>
-            <w:tcMar>
-              <w:top w:type="dxa" w:w="60"/>
-              <w:left w:type="dxa" w:w="100"/>
-              <w:bottom w:type="dxa" w:w="60"/>
-              <w:right w:type="dxa" w:w="100"/>
-            </w:tcMar>
-          </w:tcPr>
-          <w:p>
-            <w:pPr>
-              <w:spacing w:after="40" w:line="252"/>
-            </w:pPr>
-            <w:r>
-              <w:rPr>
-                <w:rFonts w:ascii="Times New Roman" w:cs="Times New Roman" w:eastAsia="Times New Roman" w:hAnsi="Times New Roman"/>
-                <w:b/>
-                <w:bCs/>
-                <w:color w:val="444444"/>
-                <w:sz w:val="20"/>
-                <w:szCs w:val="20"/>
-              </w:rPr>
-              <w:t xml:space="preserve">WHITE</w:t>
-            </w:r>
-          </w:p>
-        </w:tc>
-      </w:tr>
-      <w:tr>
-        <w:tc>
-          <w:tcPr>
-            <w:tcW w:type="dxa" w:w="3238"/>
-            <w:tcMar>
-              <w:top w:type="dxa" w:w="60"/>
-              <w:left w:type="dxa" w:w="100"/>
-              <w:bottom w:type="dxa" w:w="60"/>
-              <w:right w:type="dxa" w:w="100"/>
-            </w:tcMar>
-          </w:tcPr>
-          <w:p>
-            <w:pPr>
-              <w:spacing w:after="40" w:line="252"/>
-              <w:jc w:val="left"/>
-            </w:pPr>
-            <w:r>
-              <w:rPr>
-                <w:rFonts w:ascii="Times New Roman" w:cs="Times New Roman" w:eastAsia="Times New Roman" w:hAnsi="Times New Roman"/>
-                <w:b w:val="false"/>
-                <w:bCs w:val="false"/>
-                <w:color w:val="1A1A1A"/>
-                <w:sz w:val="20"/>
-                <w:szCs w:val="20"/>
-              </w:rPr>
-              <w:t xml:space="preserve">Coir-pith processing</w:t>
-            </w:r>
-          </w:p>
-        </w:tc>
-        <w:tc>
-          <w:tcPr>
-            <w:tcW w:type="dxa" w:w="3200"/>
-            <w:tcMar>
-              <w:top w:type="dxa" w:w="60"/>
-              <w:left w:type="dxa" w:w="100"/>
-              <w:bottom w:type="dxa" w:w="60"/>
-              <w:right w:type="dxa" w:w="100"/>
-            </w:tcMar>
-          </w:tcPr>
-          <w:p>
-            <w:pPr>
-              <w:spacing w:after="40" w:line="252"/>
-            </w:pPr>
-            <w:r>
-              <w:rPr>
-                <w:rFonts w:ascii="Times New Roman" w:cs="Times New Roman" w:eastAsia="Times New Roman" w:hAnsi="Times New Roman"/>
-                <w:b/>
-                <w:bCs/>
-                <w:color w:val="1E7D1E"/>
-                <w:sz w:val="20"/>
-                <w:szCs w:val="20"/>
-              </w:rPr>
-              <w:t xml:space="preserve">GREEN (effluent) / WHITE (dry)</w:t>
-            </w:r>
-          </w:p>
-        </w:tc>
-        <w:tc>
-          <w:tcPr>
-            <w:tcW w:type="dxa" w:w="3200"/>
-            <w:tcMar>
-              <w:top w:type="dxa" w:w="60"/>
-              <w:left w:type="dxa" w:w="100"/>
-              <w:bottom w:type="dxa" w:w="60"/>
-              <w:right w:type="dxa" w:w="100"/>
-            </w:tcMar>
-          </w:tcPr>
-          <w:p>
-            <w:pPr>
-              <w:spacing w:after="40" w:line="252"/>
-            </w:pPr>
-            <w:r>
-              <w:rPr>
-                <w:rFonts w:ascii="Times New Roman" w:cs="Times New Roman" w:eastAsia="Times New Roman" w:hAnsi="Times New Roman"/>
-                <w:b/>
-                <w:bCs/>
-                <w:color w:val="444444"/>
-                <w:sz w:val="20"/>
-                <w:szCs w:val="20"/>
-              </w:rPr>
-              <w:t xml:space="preserve">WHITE</w:t>
-            </w:r>
-          </w:p>
-        </w:tc>
-      </w:tr>
-    </w:tbl>
-    <w:p>
-      <w:pPr>
-        <w:spacing w:after="120"/>
-      </w:pPr>
-      <w:r>
-        <w:rPr>
-          <w:rFonts w:ascii="Times New Roman" w:cs="Times New Roman" w:eastAsia="Times New Roman" w:hAnsi="Times New Roman"/>
-          <w:color w:val="1A1A1A"/>
-          <w:sz w:val="22"/>
-          <w:szCs w:val="22"/>
-        </w:rPr>
-        <w:t xml:space="preserve"/>
+        <w:t xml:space="preserve">Pollachi is a coir cluster; Chittur is a supplier of raw husk. </w:t>
+      </w:r>
+      <w:r>
+        <w:rPr>
+          <w:rFonts w:ascii="Times New Roman" w:cs="Times New Roman" w:eastAsia="Times New Roman" w:hAnsi="Times New Roman"/>
+          <w:color w:val="1A1A1A"/>
+          <w:sz w:val="22"/>
+          <w:szCs w:val="22"/>
+        </w:rPr>
+        <w:t xml:space="preserve">The same raw material and the same process chain, but the primary industry clustered on the side of the border where the category is lighter.</w:t>
+      </w:r>
+    </w:p>
+    <w:p>
+      <w:pPr>
+        <w:pStyle w:val="ListParagraph"/>
+        <w:numPr>
+          <w:ilvl w:val="0"/>
+          <w:numId w:val="2"/>
+        </w:numPr>
+        <w:spacing w:after="80" w:line="268"/>
+      </w:pPr>
+      <w:r>
+        <w:rPr>
+          <w:rFonts w:ascii="Times New Roman" w:cs="Times New Roman" w:eastAsia="Times New Roman" w:hAnsi="Times New Roman"/>
+          <w:b/>
+          <w:bCs/>
+          <w:color w:val="1A1A1A"/>
+          <w:sz w:val="22"/>
+          <w:szCs w:val="22"/>
+        </w:rPr>
+        <w:t xml:space="preserve">Farmers lose twice. </w:t>
+      </w:r>
+      <w:r>
+        <w:rPr>
+          <w:rFonts w:ascii="Times New Roman" w:cs="Times New Roman" w:eastAsia="Times New Roman" w:hAnsi="Times New Roman"/>
+          <w:color w:val="1A1A1A"/>
+          <w:sz w:val="22"/>
+          <w:szCs w:val="22"/>
+        </w:rPr>
+        <w:t xml:space="preserve">We forgo the price a local processing demand would give our husk, and we forgo the local employment that retting, de-fibring and pith units would create in the Chittur belt.</w:t>
       </w:r>
     </w:p>
     <w:p>
@@ -1750,7 +1923,7 @@
           <w:sz w:val="24"/>
           <w:szCs w:val="24"/>
         </w:rPr>
-        <w:t xml:space="preserve">4.  The re-alignment is squarely within the CPCB methodology</w:t>
+        <w:t xml:space="preserve">4.  The re-alignment is squarely within the Central norm — not a dilution of safeguards</w:t>
       </w:r>
     </w:p>
     <w:p>
@@ -1764,7 +1937,7 @@
           <w:sz w:val="22"/>
           <w:szCs w:val="22"/>
         </w:rPr>
-        <w:t xml:space="preserve">The classification is not left to discretion; it is governed by a national, Pollution-Index (PI) based methodology. The </w:t>
+        <w:t xml:space="preserve">Classification is governed by a national, Pollution-Index (PI) methodology. The </w:t>
       </w:r>
       <w:r>
         <w:rPr>
@@ -1784,7 +1957,7 @@
           <w:sz w:val="22"/>
           <w:szCs w:val="22"/>
         </w:rPr>
-        <w:t xml:space="preserve">, issued under </w:t>
+        <w:t xml:space="preserve">, under </w:t>
       </w:r>
       <w:r>
         <w:rPr>
@@ -1804,47 +1977,47 @@
           <w:sz w:val="22"/>
           <w:szCs w:val="22"/>
         </w:rPr>
-        <w:t xml:space="preserve">, fix the tiers on a Pollution-Index basis — </w:t>
-      </w:r>
-      <w:r>
-        <w:rPr>
-          <w:rFonts w:ascii="Times New Roman" w:cs="Times New Roman" w:eastAsia="Times New Roman" w:hAnsi="Times New Roman"/>
-          <w:b/>
-          <w:bCs/>
-          <w:color w:val="1A1A1A"/>
-          <w:sz w:val="22"/>
-          <w:szCs w:val="22"/>
-        </w:rPr>
-        <w:t xml:space="preserve">Red (PI ≥ 60), Orange (41–59), Green (21–40), White (≤ 20)</w:t>
-      </w:r>
-      <w:r>
-        <w:rPr>
-          <w:rFonts w:ascii="Times New Roman" w:cs="Times New Roman" w:eastAsia="Times New Roman" w:hAnsi="Times New Roman"/>
-          <w:color w:val="1A1A1A"/>
-          <w:sz w:val="22"/>
-          <w:szCs w:val="22"/>
-        </w:rPr>
-        <w:t xml:space="preserve"> — carried forward by the subsequent CPCB Directions of 2025. White-category units require </w:t>
-      </w:r>
-      <w:r>
-        <w:rPr>
-          <w:rFonts w:ascii="Times New Roman" w:cs="Times New Roman" w:eastAsia="Times New Roman" w:hAnsi="Times New Roman"/>
-          <w:b/>
-          <w:bCs/>
-          <w:color w:val="1A1A1A"/>
-          <w:sz w:val="22"/>
-          <w:szCs w:val="22"/>
-        </w:rPr>
-        <w:t xml:space="preserve">no Consent to Operate</w:t>
-      </w:r>
-      <w:r>
-        <w:rPr>
-          <w:rFonts w:ascii="Times New Roman" w:cs="Times New Roman" w:eastAsia="Times New Roman" w:hAnsi="Times New Roman"/>
-          <w:color w:val="1A1A1A"/>
-          <w:sz w:val="22"/>
-          <w:szCs w:val="22"/>
-        </w:rPr>
-        <w:t xml:space="preserve">; a mere intimation to the SPCB suffices.</w:t>
+        <w:t xml:space="preserve">, fix the tiers by PI — </w:t>
+      </w:r>
+      <w:r>
+        <w:rPr>
+          <w:rFonts w:ascii="Times New Roman" w:cs="Times New Roman" w:eastAsia="Times New Roman" w:hAnsi="Times New Roman"/>
+          <w:b/>
+          <w:bCs/>
+          <w:color w:val="1A1A1A"/>
+          <w:sz w:val="22"/>
+          <w:szCs w:val="22"/>
+        </w:rPr>
+        <w:t xml:space="preserve">Red ≥ 60, Orange 41–59, Green 21–40, White ≤ 20</w:t>
+      </w:r>
+      <w:r>
+        <w:rPr>
+          <w:rFonts w:ascii="Times New Roman" w:cs="Times New Roman" w:eastAsia="Times New Roman" w:hAnsi="Times New Roman"/>
+          <w:color w:val="1A1A1A"/>
+          <w:sz w:val="22"/>
+          <w:szCs w:val="22"/>
+        </w:rPr>
+        <w:t xml:space="preserve"> — carried forward by the CPCB Directions of 2025. On that very scale a dry mechanical </w:t>
+      </w:r>
+      <w:r>
+        <w:rPr>
+          <w:rFonts w:ascii="Times New Roman" w:cs="Times New Roman" w:eastAsia="Times New Roman" w:hAnsi="Times New Roman"/>
+          <w:b/>
+          <w:bCs/>
+          <w:color w:val="1A1A1A"/>
+          <w:sz w:val="22"/>
+          <w:szCs w:val="22"/>
+        </w:rPr>
+        <w:t xml:space="preserve">de-fibring / ginning</w:t>
+      </w:r>
+      <w:r>
+        <w:rPr>
+          <w:rFonts w:ascii="Times New Roman" w:cs="Times New Roman" w:eastAsia="Times New Roman" w:hAnsi="Times New Roman"/>
+          <w:color w:val="1A1A1A"/>
+          <w:sz w:val="22"/>
+          <w:szCs w:val="22"/>
+        </w:rPr>
+        <w:t xml:space="preserve"> operation is low-index and is treated as White; the Central list itself places coir manufacturing from coconut husks in White.</w:t>
       </w:r>
     </w:p>
     <w:p>
@@ -1858,67 +2031,87 @@
           <w:sz w:val="22"/>
           <w:szCs w:val="22"/>
         </w:rPr>
-        <w:t xml:space="preserve">Under this very methodology, a </w:t>
-      </w:r>
-      <w:r>
-        <w:rPr>
-          <w:rFonts w:ascii="Times New Roman" w:cs="Times New Roman" w:eastAsia="Times New Roman" w:hAnsi="Times New Roman"/>
-          <w:b/>
-          <w:bCs/>
-          <w:color w:val="1A1A1A"/>
-          <w:sz w:val="22"/>
-          <w:szCs w:val="22"/>
-        </w:rPr>
-        <w:t xml:space="preserve">dry mechanical de-fibring / ginning operation carries a low Pollution Index</w:t>
-      </w:r>
-      <w:r>
-        <w:rPr>
-          <w:rFonts w:ascii="Times New Roman" w:cs="Times New Roman" w:eastAsia="Times New Roman" w:hAnsi="Times New Roman"/>
-          <w:color w:val="1A1A1A"/>
-          <w:sz w:val="22"/>
-          <w:szCs w:val="22"/>
-        </w:rPr>
-        <w:t xml:space="preserve"> and is treated as White by TNPCB and, in Kerala itself, dry coir manufacturing is already White. Retaining ordinary de-fibring / ginning in Orange in Kerala is therefore </w:t>
-      </w:r>
-      <w:r>
-        <w:rPr>
-          <w:rFonts w:ascii="Times New Roman" w:cs="Times New Roman" w:eastAsia="Times New Roman" w:hAnsi="Times New Roman"/>
-          <w:b/>
-          <w:bCs/>
-          <w:color w:val="1A1A1A"/>
-          <w:sz w:val="22"/>
-          <w:szCs w:val="22"/>
-        </w:rPr>
-        <w:t xml:space="preserve">stricter than the CPCB norm requires</w:t>
-      </w:r>
-      <w:r>
-        <w:rPr>
-          <w:rFonts w:ascii="Times New Roman" w:cs="Times New Roman" w:eastAsia="Times New Roman" w:hAnsi="Times New Roman"/>
-          <w:color w:val="1A1A1A"/>
-          <w:sz w:val="22"/>
-          <w:szCs w:val="22"/>
-        </w:rPr>
-        <w:t xml:space="preserve">. Retting, which involves water and effluent, legitimately warrants safeguards — but those are best delivered through </w:t>
-      </w:r>
-      <w:r>
-        <w:rPr>
-          <w:rFonts w:ascii="Times New Roman" w:cs="Times New Roman" w:eastAsia="Times New Roman" w:hAnsi="Times New Roman"/>
-          <w:b/>
-          <w:bCs/>
-          <w:color w:val="1A1A1A"/>
-          <w:sz w:val="22"/>
-          <w:szCs w:val="22"/>
-        </w:rPr>
-        <w:t xml:space="preserve">collective effluent management (Zero-Liquid-Discharge) at a Common Facility Centre</w:t>
-      </w:r>
-      <w:r>
-        <w:rPr>
-          <w:rFonts w:ascii="Times New Roman" w:cs="Times New Roman" w:eastAsia="Times New Roman" w:hAnsi="Times New Roman"/>
-          <w:color w:val="1A1A1A"/>
-          <w:sz w:val="22"/>
-          <w:szCs w:val="22"/>
-        </w:rPr>
-        <w:t xml:space="preserve">, exactly as Tamil Nadu has done, rather than through a Red-category, public-hearing-tier barrier that simply exports the industry and its jobs across the border.</w:t>
+        <w:t xml:space="preserve">Tamil Nadu proved the point in practice. By proceedings dated </w:t>
+      </w:r>
+      <w:r>
+        <w:rPr>
+          <w:rFonts w:ascii="Times New Roman" w:cs="Times New Roman" w:eastAsia="Times New Roman" w:hAnsi="Times New Roman"/>
+          <w:b/>
+          <w:bCs/>
+          <w:color w:val="1A1A1A"/>
+          <w:sz w:val="22"/>
+          <w:szCs w:val="22"/>
+        </w:rPr>
+        <w:t xml:space="preserve">10-11-2021</w:t>
+      </w:r>
+      <w:r>
+        <w:rPr>
+          <w:rFonts w:ascii="Times New Roman" w:cs="Times New Roman" w:eastAsia="Times New Roman" w:hAnsi="Times New Roman"/>
+          <w:color w:val="1A1A1A"/>
+          <w:sz w:val="22"/>
+          <w:szCs w:val="22"/>
+        </w:rPr>
+        <w:t xml:space="preserve"> TNPCB moved coir from White to Orange; after representations from coir associations it </w:t>
+      </w:r>
+      <w:r>
+        <w:rPr>
+          <w:rFonts w:ascii="Times New Roman" w:cs="Times New Roman" w:eastAsia="Times New Roman" w:hAnsi="Times New Roman"/>
+          <w:b/>
+          <w:bCs/>
+          <w:color w:val="1A1A1A"/>
+          <w:sz w:val="22"/>
+          <w:szCs w:val="22"/>
+        </w:rPr>
+        <w:t xml:space="preserve">withdrew</w:t>
+      </w:r>
+      <w:r>
+        <w:rPr>
+          <w:rFonts w:ascii="Times New Roman" w:cs="Times New Roman" w:eastAsia="Times New Roman" w:hAnsi="Times New Roman"/>
+          <w:color w:val="1A1A1A"/>
+          <w:sz w:val="22"/>
+          <w:szCs w:val="22"/>
+        </w:rPr>
+        <w:t xml:space="preserve"> that on </w:t>
+      </w:r>
+      <w:r>
+        <w:rPr>
+          <w:rFonts w:ascii="Times New Roman" w:cs="Times New Roman" w:eastAsia="Times New Roman" w:hAnsi="Times New Roman"/>
+          <w:b/>
+          <w:bCs/>
+          <w:color w:val="1A1A1A"/>
+          <w:sz w:val="22"/>
+          <w:szCs w:val="22"/>
+        </w:rPr>
+        <w:t xml:space="preserve">12-10-2023</w:t>
+      </w:r>
+      <w:r>
+        <w:rPr>
+          <w:rFonts w:ascii="Times New Roman" w:cs="Times New Roman" w:eastAsia="Times New Roman" w:hAnsi="Times New Roman"/>
+          <w:color w:val="1A1A1A"/>
+          <w:sz w:val="22"/>
+          <w:szCs w:val="22"/>
+        </w:rPr>
+        <w:t xml:space="preserve">, restoring the “coconut-husk retting / de-fibering / pith-processing industry” to White, expressly to protect the agro-based cottage MSME sector (Annexure B). Retting does use water — but that is best handled by </w:t>
+      </w:r>
+      <w:r>
+        <w:rPr>
+          <w:rFonts w:ascii="Times New Roman" w:cs="Times New Roman" w:eastAsia="Times New Roman" w:hAnsi="Times New Roman"/>
+          <w:b/>
+          <w:bCs/>
+          <w:color w:val="1A1A1A"/>
+          <w:sz w:val="22"/>
+          <w:szCs w:val="22"/>
+        </w:rPr>
+        <w:t xml:space="preserve">Zero-Liquid-Discharge at a shared Common Facility Centre</w:t>
+      </w:r>
+      <w:r>
+        <w:rPr>
+          <w:rFonts w:ascii="Times New Roman" w:cs="Times New Roman" w:eastAsia="Times New Roman" w:hAnsi="Times New Roman"/>
+          <w:color w:val="1A1A1A"/>
+          <w:sz w:val="22"/>
+          <w:szCs w:val="22"/>
+        </w:rPr>
+        <w:t xml:space="preserve">, exactly as Tamil Nadu does, not by a Red-category barrier that simply exports the industry.</w:t>
       </w:r>
     </w:p>
     <w:p>
@@ -1935,7 +2128,7 @@
           <w:sz w:val="24"/>
           <w:szCs w:val="24"/>
         </w:rPr>
-        <w:t xml:space="preserve">5.  The consequence for Chittur</w:t>
+        <w:t xml:space="preserve">5.  Our prayer</w:t>
       </w:r>
     </w:p>
     <w:p>
@@ -1949,78 +2142,7 @@
           <w:sz w:val="22"/>
           <w:szCs w:val="22"/>
         </w:rPr>
-        <w:t xml:space="preserve">Because of this gap, the </w:t>
-      </w:r>
-      <w:r>
-        <w:rPr>
-          <w:rFonts w:ascii="Times New Roman" w:cs="Times New Roman" w:eastAsia="Times New Roman" w:hAnsi="Times New Roman"/>
-          <w:b/>
-          <w:bCs/>
-          <w:color w:val="1A1A1A"/>
-          <w:sz w:val="22"/>
-          <w:szCs w:val="22"/>
-        </w:rPr>
-        <w:t xml:space="preserve">primary / value-generating processes (retting, de-fibring, pith buffering) are carried out in Pollachi</w:t>
-      </w:r>
-      <w:r>
-        <w:rPr>
-          <w:rFonts w:ascii="Times New Roman" w:cs="Times New Roman" w:eastAsia="Times New Roman" w:hAnsi="Times New Roman"/>
-          <w:color w:val="1A1A1A"/>
-          <w:sz w:val="22"/>
-          <w:szCs w:val="22"/>
-        </w:rPr>
-        <w:t xml:space="preserve">, while Kerala is left with only downstream value-addition. Coir entrepreneurs — including many from Kerala — have set up their primary units in Tamil Nadu, taking with them the investment, the employment, and the value of </w:t>
-      </w:r>
-      <w:r>
-        <w:rPr>
-          <w:rFonts w:ascii="Times New Roman" w:cs="Times New Roman" w:eastAsia="Times New Roman" w:hAnsi="Times New Roman"/>
-          <w:b/>
-          <w:bCs/>
-          <w:color w:val="1A1A1A"/>
-          <w:sz w:val="22"/>
-          <w:szCs w:val="22"/>
-        </w:rPr>
-        <w:t xml:space="preserve">our own coconut husk</w:t>
-      </w:r>
-      <w:r>
-        <w:rPr>
-          <w:rFonts w:ascii="Times New Roman" w:cs="Times New Roman" w:eastAsia="Times New Roman" w:hAnsi="Times New Roman"/>
-          <w:color w:val="1A1A1A"/>
-          <w:sz w:val="22"/>
-          <w:szCs w:val="22"/>
-        </w:rPr>
-        <w:t xml:space="preserve">. A narrow, defensible re-alignment of two categories would let that value be retained in Chittur, generating local rural and women's employment in a classic agro-based cottage sector.</w:t>
-      </w:r>
-    </w:p>
-    <w:p>
-      <w:pPr>
-        <w:pStyle w:val="Heading1"/>
-        <w:spacing w:after="100" w:before="220"/>
-      </w:pPr>
-      <w:r>
-        <w:rPr>
-          <w:rFonts w:ascii="Times New Roman" w:cs="Times New Roman" w:eastAsia="Times New Roman" w:hAnsi="Times New Roman"/>
-          <w:b/>
-          <w:bCs/>
-          <w:color w:val="0B3D0B"/>
-          <w:sz w:val="24"/>
-          <w:szCs w:val="24"/>
-        </w:rPr>
-        <w:t xml:space="preserve">6.  Our prayer</w:t>
-      </w:r>
-    </w:p>
-    <w:p>
-      <w:pPr>
-        <w:spacing w:after="120" w:line="276"/>
-      </w:pPr>
-      <w:r>
-        <w:rPr>
-          <w:rFonts w:ascii="Times New Roman" w:cs="Times New Roman" w:eastAsia="Times New Roman" w:hAnsi="Times New Roman"/>
-          <w:color w:val="1A1A1A"/>
-          <w:sz w:val="22"/>
-          <w:szCs w:val="22"/>
-        </w:rPr>
-        <w:t xml:space="preserve">We humbly request the Hon'ble Minister, in coordination with the Coir portfolio and the Kerala State Pollution Control Board, to:</w:t>
+        <w:t xml:space="preserve">We humbly request the Hon'ble Minister in charge of Pollution Control, in consultation with the Chief Minister and the Minister for Industries, to direct the Kerala State Pollution Control Board to:</w:t>
       </w:r>
     </w:p>
     <w:p>
@@ -2041,56 +2163,16 @@
           <w:sz w:val="22"/>
           <w:szCs w:val="22"/>
         </w:rPr>
-        <w:t xml:space="preserve">Re-align the two bottleneck categories. </w:t>
-      </w:r>
-      <w:r>
-        <w:rPr>
-          <w:rFonts w:ascii="Times New Roman" w:cs="Times New Roman" w:eastAsia="Times New Roman" w:hAnsi="Times New Roman"/>
-          <w:color w:val="1A1A1A"/>
-          <w:sz w:val="22"/>
-          <w:szCs w:val="22"/>
-        </w:rPr>
-        <w:t xml:space="preserve">Reclassify </w:t>
-      </w:r>
-      <w:r>
-        <w:rPr>
-          <w:rFonts w:ascii="Times New Roman" w:cs="Times New Roman" w:eastAsia="Times New Roman" w:hAnsi="Times New Roman"/>
-          <w:b/>
-          <w:bCs/>
-          <w:color w:val="1A1A1A"/>
-          <w:sz w:val="22"/>
-          <w:szCs w:val="22"/>
-        </w:rPr>
-        <w:t xml:space="preserve">coir de-fibring / ginning from Orange to White</w:t>
-      </w:r>
-      <w:r>
-        <w:rPr>
-          <w:rFonts w:ascii="Times New Roman" w:cs="Times New Roman" w:eastAsia="Times New Roman" w:hAnsi="Times New Roman"/>
-          <w:color w:val="1A1A1A"/>
-          <w:sz w:val="22"/>
-          <w:szCs w:val="22"/>
-        </w:rPr>
-        <w:t xml:space="preserve"> (a dry mechanical process, as Tamil Nadu treats it), and reduce </w:t>
-      </w:r>
-      <w:r>
-        <w:rPr>
-          <w:rFonts w:ascii="Times New Roman" w:cs="Times New Roman" w:eastAsia="Times New Roman" w:hAnsi="Times New Roman"/>
-          <w:b/>
-          <w:bCs/>
-          <w:color w:val="1A1A1A"/>
-          <w:sz w:val="22"/>
-          <w:szCs w:val="22"/>
-        </w:rPr>
-        <w:t xml:space="preserve">coconut-husk retting from Red to Green</w:t>
-      </w:r>
-      <w:r>
-        <w:rPr>
-          <w:rFonts w:ascii="Times New Roman" w:cs="Times New Roman" w:eastAsia="Times New Roman" w:hAnsi="Times New Roman"/>
-          <w:color w:val="1A1A1A"/>
-          <w:sz w:val="22"/>
-          <w:szCs w:val="22"/>
-        </w:rPr>
-        <w:t xml:space="preserve"> with mandatory Zero-Liquid-Discharge / common effluent safeguards — consistent with the CPCB PI methodology and with TNPCB's White treatment. Bleaching / dyeing / stencilling (which involve chemicals and effluent) may continue to be regulated in the Orange category.</w:t>
+        <w:t xml:space="preserve">Reclassify coir de-fibring / ginning from Orange to White</w:t>
+      </w:r>
+      <w:r>
+        <w:rPr>
+          <w:rFonts w:ascii="Times New Roman" w:cs="Times New Roman" w:eastAsia="Times New Roman" w:hAnsi="Times New Roman"/>
+          <w:color w:val="1A1A1A"/>
+          <w:sz w:val="22"/>
+          <w:szCs w:val="22"/>
+        </w:rPr>
+        <w:t xml:space="preserve"> (a dry mechanical process, as the Central norm and Tamil Nadu treat it).</w:t>
       </w:r>
     </w:p>
     <w:p>
@@ -2111,36 +2193,16 @@
           <w:sz w:val="22"/>
           <w:szCs w:val="22"/>
         </w:rPr>
-        <w:t xml:space="preserve">Grant special coir-cluster / coir industrial-zone status for Chittur, </w:t>
-      </w:r>
-      <w:r>
-        <w:rPr>
-          <w:rFonts w:ascii="Times New Roman" w:cs="Times New Roman" w:eastAsia="Times New Roman" w:hAnsi="Times New Roman"/>
-          <w:color w:val="1A1A1A"/>
-          <w:sz w:val="22"/>
-          <w:szCs w:val="22"/>
-        </w:rPr>
-        <w:t xml:space="preserve">with a Special Purpose Vehicle and a </w:t>
-      </w:r>
-      <w:r>
-        <w:rPr>
-          <w:rFonts w:ascii="Times New Roman" w:cs="Times New Roman" w:eastAsia="Times New Roman" w:hAnsi="Times New Roman"/>
-          <w:b/>
-          <w:bCs/>
-          <w:color w:val="1A1A1A"/>
-          <w:sz w:val="22"/>
-          <w:szCs w:val="22"/>
-        </w:rPr>
-        <w:t xml:space="preserve">Common Facility Centre</w:t>
-      </w:r>
-      <w:r>
-        <w:rPr>
-          <w:rFonts w:ascii="Times New Roman" w:cs="Times New Roman" w:eastAsia="Times New Roman" w:hAnsi="Times New Roman"/>
-          <w:color w:val="1A1A1A"/>
-          <w:sz w:val="22"/>
-          <w:szCs w:val="22"/>
-        </w:rPr>
-        <w:t xml:space="preserve"> (mechanised de-fibring, pith washing / block-making with Zero-Liquid-Discharge and salinity management), so that environmental concerns are addressed collectively and cost-effectively.</w:t>
+        <w:t xml:space="preserve">Reduce coconut-husk retting from Red to Green</w:t>
+      </w:r>
+      <w:r>
+        <w:rPr>
+          <w:rFonts w:ascii="Times New Roman" w:cs="Times New Roman" w:eastAsia="Times New Roman" w:hAnsi="Times New Roman"/>
+          <w:color w:val="1A1A1A"/>
+          <w:sz w:val="22"/>
+          <w:szCs w:val="22"/>
+        </w:rPr>
+        <w:t xml:space="preserve">, with mandatory Zero-Liquid-Discharge / common effluent safeguards, in line with the CPCB PI methodology and Tamil Nadu's White treatment. Bleaching / dyeing / stencilling may remain regulated (Orange), as they alone involve chemicals.</w:t>
       </w:r>
     </w:p>
     <w:p>
@@ -2161,36 +2223,16 @@
           <w:sz w:val="22"/>
           <w:szCs w:val="22"/>
         </w:rPr>
-        <w:t xml:space="preserve">Extend fiscal incentives — </w:t>
-      </w:r>
-      <w:r>
-        <w:rPr>
-          <w:rFonts w:ascii="Times New Roman" w:cs="Times New Roman" w:eastAsia="Times New Roman" w:hAnsi="Times New Roman"/>
-          <w:color w:val="1A1A1A"/>
-          <w:sz w:val="22"/>
-          <w:szCs w:val="22"/>
-        </w:rPr>
-        <w:t xml:space="preserve">capital subsidy, interest subvention, and </w:t>
-      </w:r>
-      <w:r>
-        <w:rPr>
-          <w:rFonts w:ascii="Times New Roman" w:cs="Times New Roman" w:eastAsia="Times New Roman" w:hAnsi="Times New Roman"/>
-          <w:b/>
-          <w:bCs/>
-          <w:color w:val="1A1A1A"/>
-          <w:sz w:val="22"/>
-          <w:szCs w:val="22"/>
-        </w:rPr>
-        <w:t xml:space="preserve">power-tariff parity with Tamil Nadu</w:t>
-      </w:r>
-      <w:r>
-        <w:rPr>
-          <w:rFonts w:ascii="Times New Roman" w:cs="Times New Roman" w:eastAsia="Times New Roman" w:hAnsi="Times New Roman"/>
-          <w:color w:val="1A1A1A"/>
-          <w:sz w:val="22"/>
-          <w:szCs w:val="22"/>
-        </w:rPr>
-        <w:t xml:space="preserve"> — to attract coir units to Chittur.</w:t>
+        <w:t xml:space="preserve">Sanction a coir Common Facility Centre and cluster status for Chittur</w:t>
+      </w:r>
+      <w:r>
+        <w:rPr>
+          <w:rFonts w:ascii="Times New Roman" w:cs="Times New Roman" w:eastAsia="Times New Roman" w:hAnsi="Times New Roman"/>
+          <w:color w:val="1A1A1A"/>
+          <w:sz w:val="22"/>
+          <w:szCs w:val="22"/>
+        </w:rPr>
+        <w:t xml:space="preserve"> (mechanised de-fibring, pith washing / block-making with ZLD and salinity management), so that environmental safeguards are met collectively and cheaply.</w:t>
       </w:r>
     </w:p>
     <w:p>
@@ -2211,16 +2253,16 @@
           <w:sz w:val="22"/>
           <w:szCs w:val="22"/>
         </w:rPr>
-        <w:t xml:space="preserve">Ensure a level playing field with Pollachi, </w:t>
-      </w:r>
-      <w:r>
-        <w:rPr>
-          <w:rFonts w:ascii="Times New Roman" w:cs="Times New Roman" w:eastAsia="Times New Roman" w:hAnsi="Times New Roman"/>
-          <w:color w:val="1A1A1A"/>
-          <w:sz w:val="22"/>
-          <w:szCs w:val="22"/>
-        </w:rPr>
-        <w:t xml:space="preserve">so that the value addition to Kerala's own coconut husk is retained within Kerala.</w:t>
+        <w:t xml:space="preserve">Ensure a level playing field with Pollachi</w:t>
+      </w:r>
+      <w:r>
+        <w:rPr>
+          <w:rFonts w:ascii="Times New Roman" w:cs="Times New Roman" w:eastAsia="Times New Roman" w:hAnsi="Times New Roman"/>
+          <w:color w:val="1A1A1A"/>
+          <w:sz w:val="22"/>
+          <w:szCs w:val="22"/>
+        </w:rPr>
+        <w:t xml:space="preserve"> — including power-tariff parity and MSME incentives — so that the value of Kerala's own coconut husk is retained in Kerala.</w:t>
       </w:r>
     </w:p>
     <w:p>
@@ -2237,7 +2279,7 @@
           <w:sz w:val="24"/>
           <w:szCs w:val="24"/>
         </w:rPr>
-        <w:t xml:space="preserve">7.  Annexures</w:t>
+        <w:t xml:space="preserve">6.  Annexures</w:t>
       </w:r>
     </w:p>
     <w:p>
@@ -2355,7 +2397,7 @@
           <w:sz w:val="22"/>
           <w:szCs w:val="22"/>
         </w:rPr>
-        <w:t xml:space="preserve">For and on behalf of the Chittur Agriculture Marketing Society, Kozhinjampara</w:t>
+        <w:t xml:space="preserve">For and on behalf of the coconut farmers of the Chittur Assembly Constituency,</w:t>
       </w:r>
     </w:p>
     <w:p>
@@ -2385,12 +2427,21 @@
           <w:sz w:val="22"/>
           <w:szCs w:val="22"/>
         </w:rPr>
-        <w:t xml:space="preserve">[Name, Designation]</w:t>
-      </w:r>
-    </w:p>
-    <w:p>
-      <w:pPr>
-        <w:spacing w:after="160"/>
+        <w:t xml:space="preserve">Arun</w:t>
+      </w:r>
+      <w:r>
+        <w:rPr>
+          <w:rFonts w:ascii="Times New Roman" w:cs="Times New Roman" w:eastAsia="Times New Roman" w:hAnsi="Times New Roman"/>
+          <w:color w:val="1A1A1A"/>
+          <w:sz w:val="22"/>
+          <w:szCs w:val="22"/>
+        </w:rPr>
+        <w:t xml:space="preserve">  (authorised representative of the petitioner farmers)</w:t>
+      </w:r>
+    </w:p>
+    <w:p>
+      <w:pPr>
+        <w:spacing w:after="60"/>
       </w:pPr>
       <w:r>
         <w:rPr>
@@ -2400,31 +2451,6 @@
           <w:szCs w:val="22"/>
         </w:rPr>
         <w:t xml:space="preserve">[Phone / Email]</w:t>
-      </w:r>
-    </w:p>
-    <w:p>
-      <w:pPr>
-        <w:spacing w:after="40"/>
-      </w:pPr>
-      <w:r>
-        <w:rPr>
-          <w:rFonts w:ascii="Times New Roman" w:cs="Times New Roman" w:eastAsia="Times New Roman" w:hAnsi="Times New Roman"/>
-          <w:b/>
-          <w:bCs/>
-          <w:color w:val="1A1A1A"/>
-          <w:sz w:val="22"/>
-          <w:szCs w:val="22"/>
-        </w:rPr>
-        <w:t xml:space="preserve">Endorsed by:  </w:t>
-      </w:r>
-      <w:r>
-        <w:rPr>
-          <w:rFonts w:ascii="Times New Roman" w:cs="Times New Roman" w:eastAsia="Times New Roman" w:hAnsi="Times New Roman"/>
-          <w:color w:val="1A1A1A"/>
-          <w:sz w:val="22"/>
-          <w:szCs w:val="22"/>
-        </w:rPr>
-        <w:t xml:space="preserve">Adv. Sumesh Achuthan, MLA, Chittur.</w:t>
       </w:r>
     </w:p>
     <w:p>
@@ -2512,15 +2538,15 @@
             <w:tcW w:type="dxa" w:w="2000"/>
             <w:shd w:fill="E9EFE9" w:color="auto" w:val="clear"/>
             <w:tcMar>
-              <w:top w:type="dxa" w:w="60"/>
-              <w:left w:type="dxa" w:w="100"/>
-              <w:bottom w:type="dxa" w:w="60"/>
-              <w:right w:type="dxa" w:w="100"/>
-            </w:tcMar>
-          </w:tcPr>
-          <w:p>
-            <w:pPr>
-              <w:spacing w:after="40" w:line="252"/>
+              <w:top w:type="dxa" w:w="50"/>
+              <w:left w:type="dxa" w:w="90"/>
+              <w:bottom w:type="dxa" w:w="50"/>
+              <w:right w:type="dxa" w:w="90"/>
+            </w:tcMar>
+          </w:tcPr>
+          <w:p>
+            <w:pPr>
+              <w:spacing w:after="30" w:line="248"/>
               <w:jc w:val="center"/>
             </w:pPr>
             <w:r>
@@ -2541,15 +2567,15 @@
             <w:tcW w:type="dxa" w:w="5638"/>
             <w:shd w:fill="E9EFE9" w:color="auto" w:val="clear"/>
             <w:tcMar>
-              <w:top w:type="dxa" w:w="60"/>
-              <w:left w:type="dxa" w:w="100"/>
-              <w:bottom w:type="dxa" w:w="60"/>
-              <w:right w:type="dxa" w:w="100"/>
-            </w:tcMar>
-          </w:tcPr>
-          <w:p>
-            <w:pPr>
-              <w:spacing w:after="40" w:line="252"/>
+              <w:top w:type="dxa" w:w="50"/>
+              <w:left w:type="dxa" w:w="90"/>
+              <w:bottom w:type="dxa" w:w="50"/>
+              <w:right w:type="dxa" w:w="90"/>
+            </w:tcMar>
+          </w:tcPr>
+          <w:p>
+            <w:pPr>
+              <w:spacing w:after="30" w:line="248"/>
               <w:jc w:val="left"/>
             </w:pPr>
             <w:r>
@@ -2570,15 +2596,15 @@
             <w:tcW w:type="dxa" w:w="2000"/>
             <w:shd w:fill="E9EFE9" w:color="auto" w:val="clear"/>
             <w:tcMar>
-              <w:top w:type="dxa" w:w="60"/>
-              <w:left w:type="dxa" w:w="100"/>
-              <w:bottom w:type="dxa" w:w="60"/>
-              <w:right w:type="dxa" w:w="100"/>
-            </w:tcMar>
-          </w:tcPr>
-          <w:p>
-            <w:pPr>
-              <w:spacing w:after="40" w:line="252"/>
+              <w:top w:type="dxa" w:w="50"/>
+              <w:left w:type="dxa" w:w="90"/>
+              <w:bottom w:type="dxa" w:w="50"/>
+              <w:right w:type="dxa" w:w="90"/>
+            </w:tcMar>
+          </w:tcPr>
+          <w:p>
+            <w:pPr>
+              <w:spacing w:after="30" w:line="248"/>
               <w:jc w:val="left"/>
             </w:pPr>
             <w:r>
@@ -2600,15 +2626,16 @@
           <w:tcPr>
             <w:tcW w:type="dxa" w:w="2000"/>
             <w:tcMar>
-              <w:top w:type="dxa" w:w="60"/>
-              <w:left w:type="dxa" w:w="100"/>
-              <w:bottom w:type="dxa" w:w="60"/>
-              <w:right w:type="dxa" w:w="100"/>
-            </w:tcMar>
-          </w:tcPr>
-          <w:p>
-            <w:pPr>
-              <w:spacing w:after="40" w:line="252"/>
+              <w:top w:type="dxa" w:w="50"/>
+              <w:left w:type="dxa" w:w="90"/>
+              <w:bottom w:type="dxa" w:w="50"/>
+              <w:right w:type="dxa" w:w="90"/>
+            </w:tcMar>
+          </w:tcPr>
+          <w:p>
+            <w:pPr>
+              <w:spacing w:after="30" w:line="248"/>
+              <w:jc w:val="center"/>
             </w:pPr>
             <w:r>
               <w:rPr>
@@ -2627,15 +2654,15 @@
           <w:tcPr>
             <w:tcW w:type="dxa" w:w="5638"/>
             <w:tcMar>
-              <w:top w:type="dxa" w:w="60"/>
-              <w:left w:type="dxa" w:w="100"/>
-              <w:bottom w:type="dxa" w:w="60"/>
-              <w:right w:type="dxa" w:w="100"/>
-            </w:tcMar>
-          </w:tcPr>
-          <w:p>
-            <w:pPr>
-              <w:spacing w:after="40" w:line="252"/>
+              <w:top w:type="dxa" w:w="50"/>
+              <w:left w:type="dxa" w:w="90"/>
+              <w:bottom w:type="dxa" w:w="50"/>
+              <w:right w:type="dxa" w:w="90"/>
+            </w:tcMar>
+          </w:tcPr>
+          <w:p>
+            <w:pPr>
+              <w:spacing w:after="30" w:line="248"/>
               <w:jc w:val="left"/>
             </w:pPr>
             <w:r>
@@ -2655,15 +2682,15 @@
           <w:tcPr>
             <w:tcW w:type="dxa" w:w="2000"/>
             <w:tcMar>
-              <w:top w:type="dxa" w:w="60"/>
-              <w:left w:type="dxa" w:w="100"/>
-              <w:bottom w:type="dxa" w:w="60"/>
-              <w:right w:type="dxa" w:w="100"/>
-            </w:tcMar>
-          </w:tcPr>
-          <w:p>
-            <w:pPr>
-              <w:spacing w:after="40" w:line="252"/>
+              <w:top w:type="dxa" w:w="50"/>
+              <w:left w:type="dxa" w:w="90"/>
+              <w:bottom w:type="dxa" w:w="50"/>
+              <w:right w:type="dxa" w:w="90"/>
+            </w:tcMar>
+          </w:tcPr>
+          <w:p>
+            <w:pPr>
+              <w:spacing w:after="30" w:line="248"/>
               <w:jc w:val="left"/>
             </w:pPr>
             <w:r>
@@ -2685,15 +2712,16 @@
           <w:tcPr>
             <w:tcW w:type="dxa" w:w="2000"/>
             <w:tcMar>
-              <w:top w:type="dxa" w:w="60"/>
-              <w:left w:type="dxa" w:w="100"/>
-              <w:bottom w:type="dxa" w:w="60"/>
-              <w:right w:type="dxa" w:w="100"/>
-            </w:tcMar>
-          </w:tcPr>
-          <w:p>
-            <w:pPr>
-              <w:spacing w:after="40" w:line="252"/>
+              <w:top w:type="dxa" w:w="50"/>
+              <w:left w:type="dxa" w:w="90"/>
+              <w:bottom w:type="dxa" w:w="50"/>
+              <w:right w:type="dxa" w:w="90"/>
+            </w:tcMar>
+          </w:tcPr>
+          <w:p>
+            <w:pPr>
+              <w:spacing w:after="30" w:line="248"/>
+              <w:jc w:val="center"/>
             </w:pPr>
             <w:r>
               <w:rPr>
@@ -2712,15 +2740,15 @@
           <w:tcPr>
             <w:tcW w:type="dxa" w:w="5638"/>
             <w:tcMar>
-              <w:top w:type="dxa" w:w="60"/>
-              <w:left w:type="dxa" w:w="100"/>
-              <w:bottom w:type="dxa" w:w="60"/>
-              <w:right w:type="dxa" w:w="100"/>
-            </w:tcMar>
-          </w:tcPr>
-          <w:p>
-            <w:pPr>
-              <w:spacing w:after="40" w:line="252"/>
+              <w:top w:type="dxa" w:w="50"/>
+              <w:left w:type="dxa" w:w="90"/>
+              <w:bottom w:type="dxa" w:w="50"/>
+              <w:right w:type="dxa" w:w="90"/>
+            </w:tcMar>
+          </w:tcPr>
+          <w:p>
+            <w:pPr>
+              <w:spacing w:after="30" w:line="248"/>
               <w:jc w:val="left"/>
             </w:pPr>
             <w:r>
@@ -2740,15 +2768,15 @@
           <w:tcPr>
             <w:tcW w:type="dxa" w:w="2000"/>
             <w:tcMar>
-              <w:top w:type="dxa" w:w="60"/>
-              <w:left w:type="dxa" w:w="100"/>
-              <w:bottom w:type="dxa" w:w="60"/>
-              <w:right w:type="dxa" w:w="100"/>
-            </w:tcMar>
-          </w:tcPr>
-          <w:p>
-            <w:pPr>
-              <w:spacing w:after="40" w:line="252"/>
+              <w:top w:type="dxa" w:w="50"/>
+              <w:left w:type="dxa" w:w="90"/>
+              <w:bottom w:type="dxa" w:w="50"/>
+              <w:right w:type="dxa" w:w="90"/>
+            </w:tcMar>
+          </w:tcPr>
+          <w:p>
+            <w:pPr>
+              <w:spacing w:after="30" w:line="248"/>
               <w:jc w:val="left"/>
             </w:pPr>
             <w:r>
@@ -2770,15 +2798,16 @@
           <w:tcPr>
             <w:tcW w:type="dxa" w:w="2000"/>
             <w:tcMar>
-              <w:top w:type="dxa" w:w="60"/>
-              <w:left w:type="dxa" w:w="100"/>
-              <w:bottom w:type="dxa" w:w="60"/>
-              <w:right w:type="dxa" w:w="100"/>
-            </w:tcMar>
-          </w:tcPr>
-          <w:p>
-            <w:pPr>
-              <w:spacing w:after="40" w:line="252"/>
+              <w:top w:type="dxa" w:w="50"/>
+              <w:left w:type="dxa" w:w="90"/>
+              <w:bottom w:type="dxa" w:w="50"/>
+              <w:right w:type="dxa" w:w="90"/>
+            </w:tcMar>
+          </w:tcPr>
+          <w:p>
+            <w:pPr>
+              <w:spacing w:after="30" w:line="248"/>
+              <w:jc w:val="center"/>
             </w:pPr>
             <w:r>
               <w:rPr>
@@ -2797,15 +2826,15 @@
           <w:tcPr>
             <w:tcW w:type="dxa" w:w="5638"/>
             <w:tcMar>
-              <w:top w:type="dxa" w:w="60"/>
-              <w:left w:type="dxa" w:w="100"/>
-              <w:bottom w:type="dxa" w:w="60"/>
-              <w:right w:type="dxa" w:w="100"/>
-            </w:tcMar>
-          </w:tcPr>
-          <w:p>
-            <w:pPr>
-              <w:spacing w:after="40" w:line="252"/>
+              <w:top w:type="dxa" w:w="50"/>
+              <w:left w:type="dxa" w:w="90"/>
+              <w:bottom w:type="dxa" w:w="50"/>
+              <w:right w:type="dxa" w:w="90"/>
+            </w:tcMar>
+          </w:tcPr>
+          <w:p>
+            <w:pPr>
+              <w:spacing w:after="30" w:line="248"/>
               <w:jc w:val="left"/>
             </w:pPr>
             <w:r>
@@ -2825,15 +2854,15 @@
           <w:tcPr>
             <w:tcW w:type="dxa" w:w="2000"/>
             <w:tcMar>
-              <w:top w:type="dxa" w:w="60"/>
-              <w:left w:type="dxa" w:w="100"/>
-              <w:bottom w:type="dxa" w:w="60"/>
-              <w:right w:type="dxa" w:w="100"/>
-            </w:tcMar>
-          </w:tcPr>
-          <w:p>
-            <w:pPr>
-              <w:spacing w:after="40" w:line="252"/>
+              <w:top w:type="dxa" w:w="50"/>
+              <w:left w:type="dxa" w:w="90"/>
+              <w:bottom w:type="dxa" w:w="50"/>
+              <w:right w:type="dxa" w:w="90"/>
+            </w:tcMar>
+          </w:tcPr>
+          <w:p>
+            <w:pPr>
+              <w:spacing w:after="30" w:line="248"/>
               <w:jc w:val="left"/>
             </w:pPr>
             <w:r>
@@ -2855,15 +2884,16 @@
           <w:tcPr>
             <w:tcW w:type="dxa" w:w="2000"/>
             <w:tcMar>
-              <w:top w:type="dxa" w:w="60"/>
-              <w:left w:type="dxa" w:w="100"/>
-              <w:bottom w:type="dxa" w:w="60"/>
-              <w:right w:type="dxa" w:w="100"/>
-            </w:tcMar>
-          </w:tcPr>
-          <w:p>
-            <w:pPr>
-              <w:spacing w:after="40" w:line="252"/>
+              <w:top w:type="dxa" w:w="50"/>
+              <w:left w:type="dxa" w:w="90"/>
+              <w:bottom w:type="dxa" w:w="50"/>
+              <w:right w:type="dxa" w:w="90"/>
+            </w:tcMar>
+          </w:tcPr>
+          <w:p>
+            <w:pPr>
+              <w:spacing w:after="30" w:line="248"/>
+              <w:jc w:val="center"/>
             </w:pPr>
             <w:r>
               <w:rPr>
@@ -2882,15 +2912,15 @@
           <w:tcPr>
             <w:tcW w:type="dxa" w:w="5638"/>
             <w:tcMar>
-              <w:top w:type="dxa" w:w="60"/>
-              <w:left w:type="dxa" w:w="100"/>
-              <w:bottom w:type="dxa" w:w="60"/>
-              <w:right w:type="dxa" w:w="100"/>
-            </w:tcMar>
-          </w:tcPr>
-          <w:p>
-            <w:pPr>
-              <w:spacing w:after="40" w:line="252"/>
+              <w:top w:type="dxa" w:w="50"/>
+              <w:left w:type="dxa" w:w="90"/>
+              <w:bottom w:type="dxa" w:w="50"/>
+              <w:right w:type="dxa" w:w="90"/>
+            </w:tcMar>
+          </w:tcPr>
+          <w:p>
+            <w:pPr>
+              <w:spacing w:after="30" w:line="248"/>
               <w:jc w:val="left"/>
             </w:pPr>
             <w:r>
@@ -2910,15 +2940,15 @@
           <w:tcPr>
             <w:tcW w:type="dxa" w:w="2000"/>
             <w:tcMar>
-              <w:top w:type="dxa" w:w="60"/>
-              <w:left w:type="dxa" w:w="100"/>
-              <w:bottom w:type="dxa" w:w="60"/>
-              <w:right w:type="dxa" w:w="100"/>
-            </w:tcMar>
-          </w:tcPr>
-          <w:p>
-            <w:pPr>
-              <w:spacing w:after="40" w:line="252"/>
+              <w:top w:type="dxa" w:w="50"/>
+              <w:left w:type="dxa" w:w="90"/>
+              <w:bottom w:type="dxa" w:w="50"/>
+              <w:right w:type="dxa" w:w="90"/>
+            </w:tcMar>
+          </w:tcPr>
+          <w:p>
+            <w:pPr>
+              <w:spacing w:after="30" w:line="248"/>
               <w:jc w:val="left"/>
             </w:pPr>
             <w:r>
@@ -3022,7 +3052,7 @@
           <w:sz w:val="22"/>
           <w:szCs w:val="22"/>
         </w:rPr>
-        <w:t xml:space="preserve">Under the CPCB Pollution-Index norm (Red high, Orange/Green moderate, White non-polluting), the coconut-husk retting / de-fibering / pith-processing industry stands in the </w:t>
+        <w:t xml:space="preserve">Under the CPCB Pollution-Index norm (Red high, Orange / Green moderate, White non-polluting), the coconut-husk retting / de-fibering / pith-processing industry stands in the </w:t>
       </w:r>
       <w:r>
         <w:rPr>
@@ -3172,7 +3202,7 @@
           <w:sz w:val="22"/>
           <w:szCs w:val="22"/>
         </w:rPr>
-        <w:t xml:space="preserve">, relieving these cottage/MSME units of Consent-to-Operate and monitoring burdens.</w:t>
+        <w:t xml:space="preserve">, relieving these cottage / MSME units of Consent-to-Operate and monitoring burdens.</w:t>
       </w:r>
     </w:p>
     <w:p>
@@ -3217,7 +3247,7 @@
           <w:sz w:val="22"/>
           <w:szCs w:val="22"/>
         </w:rPr>
-        <w:t xml:space="preserve"> that Tamil Nadu treats as White, on the other side of the same district border. That contrast is the core justification for the re-alignment prayed for in paragraph 6.</w:t>
+        <w:t xml:space="preserve"> that both Tamil Nadu and the Central norm treat as White, on the other side of the same district border. That contrast is the core justification for the re-alignment prayed for in paragraph 5.</w:t>
       </w:r>
     </w:p>
     <w:p>
@@ -3347,7 +3377,7 @@
                 <w:szCs w:val="17"/>
               </w:rPr>
               <w:br/>
-              <w:t xml:space="preserve">Industries Department — Coir sector in Chittur (Palakkad) — Re-alignment of the</w:t>
+              <w:t xml:space="preserve">Environment Department — Coir sector in Chittur (Palakkad) — Re-alignment of the</w:t>
             </w:r>
             <w:r>
               <w:rPr>
@@ -3377,17 +3407,17 @@
                 <w:szCs w:val="17"/>
               </w:rPr>
               <w:br/>
-              <w:t xml:space="preserve">and with the Tamil Nadu White-category treatment, and grant of special coir-cluster</w:t>
-            </w:r>
-            <w:r>
-              <w:rPr>
-                <w:rFonts w:ascii="Consolas" w:cs="Consolas" w:eastAsia="Consolas" w:hAnsi="Consolas"/>
-                <w:color w:val="1A1A1A"/>
-                <w:sz w:val="17"/>
-                <w:szCs w:val="17"/>
-              </w:rPr>
-              <w:br/>
-              <w:t xml:space="preserve">status with a Common Facility Centre — Orders issued.</w:t>
+              <w:t xml:space="preserve">and with the Tamil Nadu White-category treatment, and grant of a coir Common</w:t>
+            </w:r>
+            <w:r>
+              <w:rPr>
+                <w:rFonts w:ascii="Consolas" w:cs="Consolas" w:eastAsia="Consolas" w:hAnsi="Consolas"/>
+                <w:color w:val="1A1A1A"/>
+                <w:sz w:val="17"/>
+                <w:szCs w:val="17"/>
+              </w:rPr>
+              <w:br/>
+              <w:t xml:space="preserve">Facility Centre with cluster status — Orders issued.</w:t>
             </w:r>
             <w:r>
               <w:rPr>
@@ -3407,17 +3437,17 @@
                 <w:szCs w:val="17"/>
               </w:rPr>
               <w:br/>
-              <w:t xml:space="preserve">INDUSTRIES (COIR) DEPARTMENT</w:t>
-            </w:r>
-            <w:r>
-              <w:rPr>
-                <w:rFonts w:ascii="Consolas" w:cs="Consolas" w:eastAsia="Consolas" w:hAnsi="Consolas"/>
-                <w:color w:val="1A1A1A"/>
-                <w:sz w:val="17"/>
-                <w:szCs w:val="17"/>
-              </w:rPr>
-              <w:br/>
-              <w:t xml:space="preserve">G.O.(Ms) No. ______/2026/ID            Thiruvananthapuram, dated __-__-2026</w:t>
+              <w:t xml:space="preserve">ENVIRONMENT (POLLUTION CONTROL) DEPARTMENT</w:t>
+            </w:r>
+            <w:r>
+              <w:rPr>
+                <w:rFonts w:ascii="Consolas" w:cs="Consolas" w:eastAsia="Consolas" w:hAnsi="Consolas"/>
+                <w:color w:val="1A1A1A"/>
+                <w:sz w:val="17"/>
+                <w:szCs w:val="17"/>
+              </w:rPr>
+              <w:br/>
+              <w:t xml:space="preserve">G.O.(Ms) No. ______/2026/Envt.        Thiruvananthapuram, dated __-__-2026</w:t>
             </w:r>
             <w:r>
               <w:rPr>
@@ -3477,17 +3507,17 @@
                 <w:szCs w:val="17"/>
               </w:rPr>
               <w:br/>
-              <w:t xml:space="preserve">      3. Representation dated __-07-2026 of the Chittur Agriculture Marketing</w:t>
-            </w:r>
-            <w:r>
-              <w:rPr>
-                <w:rFonts w:ascii="Consolas" w:cs="Consolas" w:eastAsia="Consolas" w:hAnsi="Consolas"/>
-                <w:color w:val="1A1A1A"/>
-                <w:sz w:val="17"/>
-                <w:szCs w:val="17"/>
-              </w:rPr>
-              <w:br/>
-              <w:t xml:space="preserve">         Society, Kozhinjampara, forwarded by the MLA, Chittur.</w:t>
+              <w:t xml:space="preserve">      3. Representation dated __-07-2026 of the coconut farmers of the Chittur</w:t>
+            </w:r>
+            <w:r>
+              <w:rPr>
+                <w:rFonts w:ascii="Consolas" w:cs="Consolas" w:eastAsia="Consolas" w:hAnsi="Consolas"/>
+                <w:color w:val="1A1A1A"/>
+                <w:sz w:val="17"/>
+                <w:szCs w:val="17"/>
+              </w:rPr>
+              <w:br/>
+              <w:t xml:space="preserve">         Assembly Constituency, represented by Arun.</w:t>
             </w:r>
             <w:r>
               <w:rPr>
@@ -3647,67 +3677,77 @@
                 <w:szCs w:val="17"/>
               </w:rPr>
               <w:br/>
-              <w:t xml:space="preserve">  (2) a special coir-cluster / coir industrial-zone status is accorded to Chittur,</w:t>
-            </w:r>
-            <w:r>
-              <w:rPr>
-                <w:rFonts w:ascii="Consolas" w:cs="Consolas" w:eastAsia="Consolas" w:hAnsi="Consolas"/>
-                <w:color w:val="1A1A1A"/>
-                <w:sz w:val="17"/>
-                <w:szCs w:val="17"/>
-              </w:rPr>
-              <w:br/>
-              <w:t xml:space="preserve">      with an SPV and a Common Facility Centre (mechanised de-fibring, pith</w:t>
-            </w:r>
-            <w:r>
-              <w:rPr>
-                <w:rFonts w:ascii="Consolas" w:cs="Consolas" w:eastAsia="Consolas" w:hAnsi="Consolas"/>
-                <w:color w:val="1A1A1A"/>
-                <w:sz w:val="17"/>
-                <w:szCs w:val="17"/>
-              </w:rPr>
-              <w:br/>
-              <w:t xml:space="preserve">      washing / block-making with ZLD and salinity management);</w:t>
-            </w:r>
-            <w:r>
-              <w:rPr>
-                <w:rFonts w:ascii="Consolas" w:cs="Consolas" w:eastAsia="Consolas" w:hAnsi="Consolas"/>
-                <w:color w:val="1A1A1A"/>
-                <w:sz w:val="17"/>
-                <w:szCs w:val="17"/>
-              </w:rPr>
-              <w:br/>
-              <w:t xml:space="preserve">  (3) capital subsidy, interest subvention and power-tariff parity with Tamil Nadu</w:t>
-            </w:r>
-            <w:r>
-              <w:rPr>
-                <w:rFonts w:ascii="Consolas" w:cs="Consolas" w:eastAsia="Consolas" w:hAnsi="Consolas"/>
-                <w:color w:val="1A1A1A"/>
-                <w:sz w:val="17"/>
-                <w:szCs w:val="17"/>
-              </w:rPr>
-              <w:br/>
-              <w:t xml:space="preserve">      shall be extended to coir units in Chittur; and</w:t>
-            </w:r>
-            <w:r>
-              <w:rPr>
-                <w:rFonts w:ascii="Consolas" w:cs="Consolas" w:eastAsia="Consolas" w:hAnsi="Consolas"/>
-                <w:color w:val="1A1A1A"/>
-                <w:sz w:val="17"/>
-                <w:szCs w:val="17"/>
-              </w:rPr>
-              <w:br/>
-              <w:t xml:space="preserve">  (4) the Industries and Coir Directorates shall ensure a level playing field so</w:t>
-            </w:r>
-            <w:r>
-              <w:rPr>
-                <w:rFonts w:ascii="Consolas" w:cs="Consolas" w:eastAsia="Consolas" w:hAnsi="Consolas"/>
-                <w:color w:val="1A1A1A"/>
-                <w:sz w:val="17"/>
-                <w:szCs w:val="17"/>
-              </w:rPr>
-              <w:br/>
-              <w:t xml:space="preserve">      that value addition to Kerala's coconut husk is retained within the State.</w:t>
+              <w:t xml:space="preserve">  (2) a coir Common Facility Centre with cluster status is sanctioned for Chittur</w:t>
+            </w:r>
+            <w:r>
+              <w:rPr>
+                <w:rFonts w:ascii="Consolas" w:cs="Consolas" w:eastAsia="Consolas" w:hAnsi="Consolas"/>
+                <w:color w:val="1A1A1A"/>
+                <w:sz w:val="17"/>
+                <w:szCs w:val="17"/>
+              </w:rPr>
+              <w:br/>
+              <w:t xml:space="preserve">      (mechanised de-fibring, pith washing / block-making with ZLD and salinity</w:t>
+            </w:r>
+            <w:r>
+              <w:rPr>
+                <w:rFonts w:ascii="Consolas" w:cs="Consolas" w:eastAsia="Consolas" w:hAnsi="Consolas"/>
+                <w:color w:val="1A1A1A"/>
+                <w:sz w:val="17"/>
+                <w:szCs w:val="17"/>
+              </w:rPr>
+              <w:br/>
+              <w:t xml:space="preserve">      management);</w:t>
+            </w:r>
+            <w:r>
+              <w:rPr>
+                <w:rFonts w:ascii="Consolas" w:cs="Consolas" w:eastAsia="Consolas" w:hAnsi="Consolas"/>
+                <w:color w:val="1A1A1A"/>
+                <w:sz w:val="17"/>
+                <w:szCs w:val="17"/>
+              </w:rPr>
+              <w:br/>
+              <w:t xml:space="preserve">  (3) power-tariff parity with Tamil Nadu and MSME incentives shall be extended to</w:t>
+            </w:r>
+            <w:r>
+              <w:rPr>
+                <w:rFonts w:ascii="Consolas" w:cs="Consolas" w:eastAsia="Consolas" w:hAnsi="Consolas"/>
+                <w:color w:val="1A1A1A"/>
+                <w:sz w:val="17"/>
+                <w:szCs w:val="17"/>
+              </w:rPr>
+              <w:br/>
+              <w:t xml:space="preserve">      coir units in Chittur; and</w:t>
+            </w:r>
+            <w:r>
+              <w:rPr>
+                <w:rFonts w:ascii="Consolas" w:cs="Consolas" w:eastAsia="Consolas" w:hAnsi="Consolas"/>
+                <w:color w:val="1A1A1A"/>
+                <w:sz w:val="17"/>
+                <w:szCs w:val="17"/>
+              </w:rPr>
+              <w:br/>
+              <w:t xml:space="preserve">  (4) the Environment, Industries and Coir Directorates shall ensure a level</w:t>
+            </w:r>
+            <w:r>
+              <w:rPr>
+                <w:rFonts w:ascii="Consolas" w:cs="Consolas" w:eastAsia="Consolas" w:hAnsi="Consolas"/>
+                <w:color w:val="1A1A1A"/>
+                <w:sz w:val="17"/>
+                <w:szCs w:val="17"/>
+              </w:rPr>
+              <w:br/>
+              <w:t xml:space="preserve">      playing field so that value addition to Kerala's coconut husk is retained</w:t>
+            </w:r>
+            <w:r>
+              <w:rPr>
+                <w:rFonts w:ascii="Consolas" w:cs="Consolas" w:eastAsia="Consolas" w:hAnsi="Consolas"/>
+                <w:color w:val="1A1A1A"/>
+                <w:sz w:val="17"/>
+                <w:szCs w:val="17"/>
+              </w:rPr>
+              <w:br/>
+              <w:t xml:space="preserve">      within the State.</w:t>
             </w:r>
             <w:r>
               <w:rPr>
@@ -3767,27 +3807,27 @@
                 <w:szCs w:val="17"/>
               </w:rPr>
               <w:br/>
-              <w:t xml:space="preserve">To  The Director of Industries &amp; Commerce; the Director of Coir Development;</w:t>
-            </w:r>
-            <w:r>
-              <w:rPr>
-                <w:rFonts w:ascii="Consolas" w:cs="Consolas" w:eastAsia="Consolas" w:hAnsi="Consolas"/>
-                <w:color w:val="1A1A1A"/>
-                <w:sz w:val="17"/>
-                <w:szCs w:val="17"/>
-              </w:rPr>
-              <w:br/>
-              <w:t xml:space="preserve">    the Chairman, Kerala State Pollution Control Board.</w:t>
-            </w:r>
-            <w:r>
-              <w:rPr>
-                <w:rFonts w:ascii="Consolas" w:cs="Consolas" w:eastAsia="Consolas" w:hAnsi="Consolas"/>
-                <w:color w:val="1A1A1A"/>
-                <w:sz w:val="17"/>
-                <w:szCs w:val="17"/>
-              </w:rPr>
-              <w:br/>
-              <w:t xml:space="preserve">    Copy to: the Minister for Coir; Environment Department; the MLA, Chittur.</w:t>
+              <w:t xml:space="preserve">To  The Chairman, Kerala State Pollution Control Board; the Director of Industries</w:t>
+            </w:r>
+            <w:r>
+              <w:rPr>
+                <w:rFonts w:ascii="Consolas" w:cs="Consolas" w:eastAsia="Consolas" w:hAnsi="Consolas"/>
+                <w:color w:val="1A1A1A"/>
+                <w:sz w:val="17"/>
+                <w:szCs w:val="17"/>
+              </w:rPr>
+              <w:br/>
+              <w:t xml:space="preserve">    &amp; Commerce; the Director of Coir Development.</w:t>
+            </w:r>
+            <w:r>
+              <w:rPr>
+                <w:rFonts w:ascii="Consolas" w:cs="Consolas" w:eastAsia="Consolas" w:hAnsi="Consolas"/>
+                <w:color w:val="1A1A1A"/>
+                <w:sz w:val="17"/>
+                <w:szCs w:val="17"/>
+              </w:rPr>
+              <w:br/>
+              <w:t xml:space="preserve">    Copy to: the Chief Minister's Office; the Minister for Industries; the MLA, Chittur.</w:t>
             </w:r>
           </w:p>
         </w:tc>
@@ -3966,7 +4006,7 @@
         <w:sz w:val="16"/>
         <w:szCs w:val="16"/>
       </w:rPr>
-      <w:t xml:space="preserve">Chittur Agriculture Marketing Society, Kozhinjampara</w:t>
+      <w:t xml:space="preserve">Coconut farmers of Chittur Assembly Constituency</w:t>
     </w:r>
   </w:p>
 </w:hdr>

</xml_diff>